<commit_message>
aniadida toda la documentacion en modo TODO
</commit_message>
<xml_diff>
--- a/DOCUMENTACION/Manual_de_usuario.docx
+++ b/DOCUMENTACION/Manual_de_usuario.docx
@@ -363,7 +363,7 @@
     </w:p>
     <w:p>
       <w:pPr>
-        <w:pStyle w:val="Ttulodelndicedeusuario"/>
+        <w:pStyle w:val="Ttulodelndicedeusuariouser"/>
         <w:suppressLineNumbers/>
         <w:bidi w:val="0"/>
         <w:ind w:hanging="0" w:start="0"/>
@@ -377,7 +377,7 @@
     </w:p>
     <w:p>
       <w:pPr>
-        <w:pStyle w:val="ndicedeusuario1"/>
+        <w:pStyle w:val="ndicedeusuario1user"/>
         <w:tabs>
           <w:tab w:val="clear" w:pos="9638"/>
           <w:tab w:val="right" w:pos="9637" w:leader="dot"/>
@@ -408,7 +408,7 @@
     </w:p>
     <w:p>
       <w:pPr>
-        <w:pStyle w:val="ndicedeusuario1"/>
+        <w:pStyle w:val="ndicedeusuario1user"/>
         <w:tabs>
           <w:tab w:val="clear" w:pos="9638"/>
           <w:tab w:val="right" w:pos="9637" w:leader="dot"/>
@@ -426,7 +426,7 @@
     </w:p>
     <w:p>
       <w:pPr>
-        <w:pStyle w:val="ndicedeusuario1"/>
+        <w:pStyle w:val="ndicedeusuario1user"/>
         <w:tabs>
           <w:tab w:val="clear" w:pos="9638"/>
           <w:tab w:val="right" w:pos="9637" w:leader="dot"/>
@@ -953,17 +953,26 @@
           <w:szCs w:val="52"/>
           <w:shd w:fill="auto" w:val="clear"/>
         </w:rPr>
+      </w:r>
+      <w:r>
+        <w:rPr>
+          <w:b/>
+          <w:bCs/>
+          <w:sz w:val="52"/>
+          <w:szCs w:val="52"/>
+          <w:shd w:fill="auto" w:val="clear"/>
+        </w:rPr>
+        <w:fldChar w:fldCharType="end"/>
+      </w:r>
+      <w:r>
+        <w:rPr>
+          <w:b/>
+          <w:bCs/>
+          <w:sz w:val="52"/>
+          <w:szCs w:val="52"/>
+          <w:shd w:fill="auto" w:val="clear"/>
+        </w:rPr>
         <w:t>Introducción</w:t>
-      </w:r>
-      <w:r>
-        <w:rPr>
-          <w:b/>
-          <w:bCs/>
-          <w:sz w:val="52"/>
-          <w:szCs w:val="52"/>
-          <w:shd w:fill="auto" w:val="clear"/>
-        </w:rPr>
-        <w:fldChar w:fldCharType="end"/>
       </w:r>
     </w:p>
     <w:p>
@@ -1331,132 +1340,6 @@
       <w:pPr>
         <w:pStyle w:val="Normal"/>
         <w:bidi w:val="0"/>
-        <w:jc w:val="start"/>
-        <w:rPr>
-          <w:b/>
-          <w:bCs/>
-          <w:sz w:val="52"/>
-          <w:szCs w:val="52"/>
-        </w:rPr>
-      </w:pPr>
-      <w:r>
-        <w:rPr>
-          <w:b/>
-          <w:bCs/>
-          <w:sz w:val="52"/>
-          <w:szCs w:val="52"/>
-        </w:rPr>
-      </w:r>
-    </w:p>
-    <w:p>
-      <w:pPr>
-        <w:pStyle w:val="Normal"/>
-        <w:bidi w:val="0"/>
-        <w:jc w:val="start"/>
-        <w:rPr>
-          <w:b/>
-          <w:bCs/>
-          <w:sz w:val="52"/>
-          <w:szCs w:val="52"/>
-        </w:rPr>
-      </w:pPr>
-      <w:r>
-        <w:rPr>
-          <w:b/>
-          <w:bCs/>
-          <w:sz w:val="52"/>
-          <w:szCs w:val="52"/>
-        </w:rPr>
-      </w:r>
-    </w:p>
-    <w:p>
-      <w:pPr>
-        <w:pStyle w:val="Normal"/>
-        <w:bidi w:val="0"/>
-        <w:jc w:val="start"/>
-        <w:rPr>
-          <w:b/>
-          <w:bCs/>
-          <w:sz w:val="52"/>
-          <w:szCs w:val="52"/>
-        </w:rPr>
-      </w:pPr>
-      <w:r>
-        <w:rPr>
-          <w:b/>
-          <w:bCs/>
-          <w:sz w:val="52"/>
-          <w:szCs w:val="52"/>
-        </w:rPr>
-      </w:r>
-    </w:p>
-    <w:p>
-      <w:pPr>
-        <w:pStyle w:val="Normal"/>
-        <w:bidi w:val="0"/>
-        <w:jc w:val="start"/>
-        <w:rPr>
-          <w:b/>
-          <w:bCs/>
-          <w:sz w:val="52"/>
-          <w:szCs w:val="52"/>
-        </w:rPr>
-      </w:pPr>
-      <w:r>
-        <w:rPr>
-          <w:b/>
-          <w:bCs/>
-          <w:sz w:val="52"/>
-          <w:szCs w:val="52"/>
-        </w:rPr>
-      </w:r>
-    </w:p>
-    <w:p>
-      <w:pPr>
-        <w:pStyle w:val="Normal"/>
-        <w:bidi w:val="0"/>
-        <w:jc w:val="start"/>
-        <w:rPr>
-          <w:b/>
-          <w:bCs/>
-          <w:sz w:val="52"/>
-          <w:szCs w:val="52"/>
-        </w:rPr>
-      </w:pPr>
-      <w:r>
-        <w:rPr>
-          <w:b/>
-          <w:bCs/>
-          <w:sz w:val="52"/>
-          <w:szCs w:val="52"/>
-        </w:rPr>
-      </w:r>
-    </w:p>
-    <w:p>
-      <w:pPr>
-        <w:pStyle w:val="Normal"/>
-        <w:bidi w:val="0"/>
-        <w:jc w:val="start"/>
-        <w:rPr>
-          <w:b/>
-          <w:bCs/>
-          <w:sz w:val="52"/>
-          <w:szCs w:val="52"/>
-        </w:rPr>
-      </w:pPr>
-      <w:r>
-        <w:rPr>
-          <w:b/>
-          <w:bCs/>
-          <w:sz w:val="52"/>
-          <w:szCs w:val="52"/>
-        </w:rPr>
-      </w:r>
-    </w:p>
-    <w:p>
-      <w:pPr>
-        <w:pStyle w:val="Normal"/>
-        <w:bidi w:val="0"/>
         <w:jc w:val="center"/>
         <w:rPr>
           <w:b/>
@@ -1493,8 +1376,509 @@
           <w:sz w:val="52"/>
           <w:szCs w:val="52"/>
         </w:rPr>
+      </w:r>
+      <w:r>
+        <w:rPr>
+          <w:b/>
+          <w:bCs/>
+          <w:sz w:val="52"/>
+          <w:szCs w:val="52"/>
+        </w:rPr>
+        <w:fldChar w:fldCharType="end"/>
+      </w:r>
+      <w:r>
+        <w:rPr>
+          <w:b/>
+          <w:bCs/>
+          <w:sz w:val="52"/>
+          <w:szCs w:val="52"/>
+        </w:rPr>
         <w:t>Desarrollo</w:t>
       </w:r>
+    </w:p>
+    <w:p>
+      <w:pPr>
+        <w:pStyle w:val="Normal"/>
+        <w:bidi w:val="0"/>
+        <w:jc w:val="start"/>
+        <w:rPr>
+          <w:b/>
+          <w:bCs/>
+          <w:sz w:val="52"/>
+          <w:szCs w:val="52"/>
+        </w:rPr>
+      </w:pPr>
+      <w:r>
+        <w:rPr>
+          <w:b/>
+          <w:bCs/>
+          <w:sz w:val="52"/>
+          <w:szCs w:val="52"/>
+        </w:rPr>
+        <w:t>TODO AÑADIR EL DESARROLLO DEL MANUAL</w:t>
+      </w:r>
+    </w:p>
+    <w:p>
+      <w:pPr>
+        <w:pStyle w:val="Normal"/>
+        <w:bidi w:val="0"/>
+        <w:jc w:val="start"/>
+        <w:rPr>
+          <w:b/>
+          <w:bCs/>
+          <w:sz w:val="52"/>
+          <w:szCs w:val="52"/>
+        </w:rPr>
+      </w:pPr>
+      <w:r>
+        <w:rPr>
+          <w:b/>
+          <w:bCs/>
+          <w:sz w:val="52"/>
+          <w:szCs w:val="52"/>
+        </w:rPr>
+      </w:r>
+    </w:p>
+    <w:p>
+      <w:pPr>
+        <w:pStyle w:val="Normal"/>
+        <w:bidi w:val="0"/>
+        <w:jc w:val="start"/>
+        <w:rPr>
+          <w:b/>
+          <w:bCs/>
+          <w:sz w:val="52"/>
+          <w:szCs w:val="52"/>
+        </w:rPr>
+      </w:pPr>
+      <w:r>
+        <w:rPr>
+          <w:b/>
+          <w:bCs/>
+          <w:sz w:val="52"/>
+          <w:szCs w:val="52"/>
+        </w:rPr>
+      </w:r>
+    </w:p>
+    <w:p>
+      <w:pPr>
+        <w:pStyle w:val="Normal"/>
+        <w:bidi w:val="0"/>
+        <w:jc w:val="start"/>
+        <w:rPr>
+          <w:b/>
+          <w:bCs/>
+          <w:sz w:val="52"/>
+          <w:szCs w:val="52"/>
+        </w:rPr>
+      </w:pPr>
+      <w:r>
+        <w:rPr>
+          <w:b/>
+          <w:bCs/>
+          <w:sz w:val="52"/>
+          <w:szCs w:val="52"/>
+        </w:rPr>
+      </w:r>
+    </w:p>
+    <w:p>
+      <w:pPr>
+        <w:pStyle w:val="Normal"/>
+        <w:bidi w:val="0"/>
+        <w:jc w:val="start"/>
+        <w:rPr>
+          <w:b/>
+          <w:bCs/>
+          <w:sz w:val="52"/>
+          <w:szCs w:val="52"/>
+        </w:rPr>
+      </w:pPr>
+      <w:r>
+        <w:rPr>
+          <w:b/>
+          <w:bCs/>
+          <w:sz w:val="52"/>
+          <w:szCs w:val="52"/>
+        </w:rPr>
+      </w:r>
+    </w:p>
+    <w:p>
+      <w:pPr>
+        <w:pStyle w:val="Normal"/>
+        <w:bidi w:val="0"/>
+        <w:jc w:val="start"/>
+        <w:rPr>
+          <w:b/>
+          <w:bCs/>
+          <w:sz w:val="52"/>
+          <w:szCs w:val="52"/>
+        </w:rPr>
+      </w:pPr>
+      <w:r>
+        <w:rPr>
+          <w:b/>
+          <w:bCs/>
+          <w:sz w:val="52"/>
+          <w:szCs w:val="52"/>
+        </w:rPr>
+      </w:r>
+    </w:p>
+    <w:p>
+      <w:pPr>
+        <w:pStyle w:val="Normal"/>
+        <w:bidi w:val="0"/>
+        <w:jc w:val="start"/>
+        <w:rPr>
+          <w:b/>
+          <w:bCs/>
+          <w:sz w:val="52"/>
+          <w:szCs w:val="52"/>
+        </w:rPr>
+      </w:pPr>
+      <w:r>
+        <w:rPr>
+          <w:b/>
+          <w:bCs/>
+          <w:sz w:val="52"/>
+          <w:szCs w:val="52"/>
+        </w:rPr>
+      </w:r>
+    </w:p>
+    <w:p>
+      <w:pPr>
+        <w:pStyle w:val="Normal"/>
+        <w:bidi w:val="0"/>
+        <w:jc w:val="start"/>
+        <w:rPr>
+          <w:b/>
+          <w:bCs/>
+          <w:sz w:val="52"/>
+          <w:szCs w:val="52"/>
+        </w:rPr>
+      </w:pPr>
+      <w:r>
+        <w:rPr>
+          <w:b/>
+          <w:bCs/>
+          <w:sz w:val="52"/>
+          <w:szCs w:val="52"/>
+        </w:rPr>
+      </w:r>
+    </w:p>
+    <w:p>
+      <w:pPr>
+        <w:pStyle w:val="Normal"/>
+        <w:bidi w:val="0"/>
+        <w:jc w:val="start"/>
+        <w:rPr>
+          <w:b/>
+          <w:bCs/>
+          <w:sz w:val="52"/>
+          <w:szCs w:val="52"/>
+        </w:rPr>
+      </w:pPr>
+      <w:r>
+        <w:rPr>
+          <w:b/>
+          <w:bCs/>
+          <w:sz w:val="52"/>
+          <w:szCs w:val="52"/>
+        </w:rPr>
+      </w:r>
+    </w:p>
+    <w:p>
+      <w:pPr>
+        <w:pStyle w:val="Normal"/>
+        <w:bidi w:val="0"/>
+        <w:jc w:val="start"/>
+        <w:rPr>
+          <w:b/>
+          <w:bCs/>
+          <w:sz w:val="52"/>
+          <w:szCs w:val="52"/>
+        </w:rPr>
+      </w:pPr>
+      <w:r>
+        <w:rPr>
+          <w:b/>
+          <w:bCs/>
+          <w:sz w:val="52"/>
+          <w:szCs w:val="52"/>
+        </w:rPr>
+      </w:r>
+    </w:p>
+    <w:p>
+      <w:pPr>
+        <w:pStyle w:val="Normal"/>
+        <w:bidi w:val="0"/>
+        <w:jc w:val="start"/>
+        <w:rPr>
+          <w:b/>
+          <w:bCs/>
+          <w:sz w:val="52"/>
+          <w:szCs w:val="52"/>
+        </w:rPr>
+      </w:pPr>
+      <w:r>
+        <w:rPr>
+          <w:b/>
+          <w:bCs/>
+          <w:sz w:val="52"/>
+          <w:szCs w:val="52"/>
+        </w:rPr>
+      </w:r>
+    </w:p>
+    <w:p>
+      <w:pPr>
+        <w:pStyle w:val="Normal"/>
+        <w:bidi w:val="0"/>
+        <w:jc w:val="start"/>
+        <w:rPr>
+          <w:b/>
+          <w:bCs/>
+          <w:sz w:val="52"/>
+          <w:szCs w:val="52"/>
+        </w:rPr>
+      </w:pPr>
+      <w:r>
+        <w:rPr>
+          <w:b/>
+          <w:bCs/>
+          <w:sz w:val="52"/>
+          <w:szCs w:val="52"/>
+        </w:rPr>
+      </w:r>
+    </w:p>
+    <w:p>
+      <w:pPr>
+        <w:pStyle w:val="Normal"/>
+        <w:bidi w:val="0"/>
+        <w:jc w:val="start"/>
+        <w:rPr>
+          <w:b/>
+          <w:bCs/>
+          <w:sz w:val="52"/>
+          <w:szCs w:val="52"/>
+        </w:rPr>
+      </w:pPr>
+      <w:r>
+        <w:rPr>
+          <w:b/>
+          <w:bCs/>
+          <w:sz w:val="52"/>
+          <w:szCs w:val="52"/>
+        </w:rPr>
+      </w:r>
+    </w:p>
+    <w:p>
+      <w:pPr>
+        <w:pStyle w:val="Normal"/>
+        <w:bidi w:val="0"/>
+        <w:jc w:val="start"/>
+        <w:rPr>
+          <w:b/>
+          <w:bCs/>
+          <w:sz w:val="52"/>
+          <w:szCs w:val="52"/>
+        </w:rPr>
+      </w:pPr>
+      <w:r>
+        <w:rPr>
+          <w:b/>
+          <w:bCs/>
+          <w:sz w:val="52"/>
+          <w:szCs w:val="52"/>
+        </w:rPr>
+      </w:r>
+    </w:p>
+    <w:p>
+      <w:pPr>
+        <w:pStyle w:val="Normal"/>
+        <w:bidi w:val="0"/>
+        <w:jc w:val="start"/>
+        <w:rPr>
+          <w:b/>
+          <w:bCs/>
+          <w:sz w:val="52"/>
+          <w:szCs w:val="52"/>
+        </w:rPr>
+      </w:pPr>
+      <w:r>
+        <w:rPr>
+          <w:b/>
+          <w:bCs/>
+          <w:sz w:val="52"/>
+          <w:szCs w:val="52"/>
+        </w:rPr>
+      </w:r>
+    </w:p>
+    <w:p>
+      <w:pPr>
+        <w:pStyle w:val="Normal"/>
+        <w:bidi w:val="0"/>
+        <w:jc w:val="start"/>
+        <w:rPr>
+          <w:b/>
+          <w:bCs/>
+          <w:sz w:val="52"/>
+          <w:szCs w:val="52"/>
+        </w:rPr>
+      </w:pPr>
+      <w:r>
+        <w:rPr>
+          <w:b/>
+          <w:bCs/>
+          <w:sz w:val="52"/>
+          <w:szCs w:val="52"/>
+        </w:rPr>
+      </w:r>
+    </w:p>
+    <w:p>
+      <w:pPr>
+        <w:pStyle w:val="Normal"/>
+        <w:bidi w:val="0"/>
+        <w:jc w:val="start"/>
+        <w:rPr>
+          <w:b/>
+          <w:bCs/>
+          <w:sz w:val="52"/>
+          <w:szCs w:val="52"/>
+        </w:rPr>
+      </w:pPr>
+      <w:r>
+        <w:rPr>
+          <w:b/>
+          <w:bCs/>
+          <w:sz w:val="52"/>
+          <w:szCs w:val="52"/>
+        </w:rPr>
+      </w:r>
+    </w:p>
+    <w:p>
+      <w:pPr>
+        <w:pStyle w:val="Normal"/>
+        <w:bidi w:val="0"/>
+        <w:jc w:val="start"/>
+        <w:rPr>
+          <w:b/>
+          <w:bCs/>
+          <w:sz w:val="52"/>
+          <w:szCs w:val="52"/>
+        </w:rPr>
+      </w:pPr>
+      <w:r>
+        <w:rPr>
+          <w:b/>
+          <w:bCs/>
+          <w:sz w:val="52"/>
+          <w:szCs w:val="52"/>
+        </w:rPr>
+      </w:r>
+    </w:p>
+    <w:p>
+      <w:pPr>
+        <w:pStyle w:val="Normal"/>
+        <w:bidi w:val="0"/>
+        <w:jc w:val="start"/>
+        <w:rPr>
+          <w:b/>
+          <w:bCs/>
+          <w:sz w:val="52"/>
+          <w:szCs w:val="52"/>
+        </w:rPr>
+      </w:pPr>
+      <w:r>
+        <w:rPr>
+          <w:b/>
+          <w:bCs/>
+          <w:sz w:val="52"/>
+          <w:szCs w:val="52"/>
+        </w:rPr>
+      </w:r>
+    </w:p>
+    <w:p>
+      <w:pPr>
+        <w:pStyle w:val="Normal"/>
+        <w:bidi w:val="0"/>
+        <w:jc w:val="start"/>
+        <w:rPr>
+          <w:b/>
+          <w:bCs/>
+          <w:sz w:val="52"/>
+          <w:szCs w:val="52"/>
+        </w:rPr>
+      </w:pPr>
+      <w:r>
+        <w:rPr>
+          <w:b/>
+          <w:bCs/>
+          <w:sz w:val="52"/>
+          <w:szCs w:val="52"/>
+        </w:rPr>
+      </w:r>
+    </w:p>
+    <w:p>
+      <w:pPr>
+        <w:pStyle w:val="Normal"/>
+        <w:bidi w:val="0"/>
+        <w:jc w:val="start"/>
+        <w:rPr>
+          <w:b/>
+          <w:bCs/>
+          <w:sz w:val="52"/>
+          <w:szCs w:val="52"/>
+        </w:rPr>
+      </w:pPr>
+      <w:r>
+        <w:rPr>
+          <w:b/>
+          <w:bCs/>
+          <w:sz w:val="52"/>
+          <w:szCs w:val="52"/>
+        </w:rPr>
+      </w:r>
+    </w:p>
+    <w:p>
+      <w:pPr>
+        <w:pStyle w:val="Normal"/>
+        <w:bidi w:val="0"/>
+        <w:jc w:val="center"/>
+        <w:rPr>
+          <w:b/>
+          <w:bCs/>
+          <w:sz w:val="52"/>
+          <w:szCs w:val="52"/>
+        </w:rPr>
+      </w:pPr>
+      <w:r>
+        <w:fldChar w:fldCharType="begin"/>
+      </w:r>
+      <w:r>
+        <w:rPr>
+          <w:b/>
+          <w:bCs/>
+          <w:sz w:val="52"/>
+          <w:szCs w:val="52"/>
+        </w:rPr>
+        <w:instrText xml:space="preserve"> XE "Bibliografia" \f "Índice personalizado" </w:instrText>
+      </w:r>
+      <w:r>
+        <w:rPr>
+          <w:b/>
+          <w:bCs/>
+          <w:sz w:val="52"/>
+          <w:szCs w:val="52"/>
+        </w:rPr>
+        <w:fldChar w:fldCharType="separate"/>
+      </w:r>
+      <w:r>
+        <w:rPr>
+          <w:b/>
+          <w:bCs/>
+          <w:sz w:val="52"/>
+          <w:szCs w:val="52"/>
+        </w:rPr>
+      </w:r>
       <w:r>
         <w:rPr>
           <w:b/>
@@ -1504,419 +1888,6 @@
         </w:rPr>
         <w:fldChar w:fldCharType="end"/>
       </w:r>
-    </w:p>
-    <w:p>
-      <w:pPr>
-        <w:pStyle w:val="Normal"/>
-        <w:bidi w:val="0"/>
-        <w:jc w:val="start"/>
-        <w:rPr>
-          <w:b/>
-          <w:bCs/>
-          <w:sz w:val="52"/>
-          <w:szCs w:val="52"/>
-        </w:rPr>
-      </w:pPr>
-      <w:r>
-        <w:rPr>
-          <w:b/>
-          <w:bCs/>
-          <w:sz w:val="52"/>
-          <w:szCs w:val="52"/>
-        </w:rPr>
-        <w:t>TODO AÑADIR EL DESARROLLO DEL MANUAL</w:t>
-      </w:r>
-    </w:p>
-    <w:p>
-      <w:pPr>
-        <w:pStyle w:val="Normal"/>
-        <w:bidi w:val="0"/>
-        <w:jc w:val="start"/>
-        <w:rPr>
-          <w:b/>
-          <w:bCs/>
-          <w:sz w:val="52"/>
-          <w:szCs w:val="52"/>
-        </w:rPr>
-      </w:pPr>
-      <w:r>
-        <w:rPr>
-          <w:b/>
-          <w:bCs/>
-          <w:sz w:val="52"/>
-          <w:szCs w:val="52"/>
-        </w:rPr>
-      </w:r>
-    </w:p>
-    <w:p>
-      <w:pPr>
-        <w:pStyle w:val="Normal"/>
-        <w:bidi w:val="0"/>
-        <w:jc w:val="start"/>
-        <w:rPr>
-          <w:b/>
-          <w:bCs/>
-          <w:sz w:val="52"/>
-          <w:szCs w:val="52"/>
-        </w:rPr>
-      </w:pPr>
-      <w:r>
-        <w:rPr>
-          <w:b/>
-          <w:bCs/>
-          <w:sz w:val="52"/>
-          <w:szCs w:val="52"/>
-        </w:rPr>
-      </w:r>
-    </w:p>
-    <w:p>
-      <w:pPr>
-        <w:pStyle w:val="Normal"/>
-        <w:bidi w:val="0"/>
-        <w:jc w:val="start"/>
-        <w:rPr>
-          <w:b/>
-          <w:bCs/>
-          <w:sz w:val="52"/>
-          <w:szCs w:val="52"/>
-        </w:rPr>
-      </w:pPr>
-      <w:r>
-        <w:rPr>
-          <w:b/>
-          <w:bCs/>
-          <w:sz w:val="52"/>
-          <w:szCs w:val="52"/>
-        </w:rPr>
-      </w:r>
-    </w:p>
-    <w:p>
-      <w:pPr>
-        <w:pStyle w:val="Normal"/>
-        <w:bidi w:val="0"/>
-        <w:jc w:val="start"/>
-        <w:rPr>
-          <w:b/>
-          <w:bCs/>
-          <w:sz w:val="52"/>
-          <w:szCs w:val="52"/>
-        </w:rPr>
-      </w:pPr>
-      <w:r>
-        <w:rPr>
-          <w:b/>
-          <w:bCs/>
-          <w:sz w:val="52"/>
-          <w:szCs w:val="52"/>
-        </w:rPr>
-      </w:r>
-    </w:p>
-    <w:p>
-      <w:pPr>
-        <w:pStyle w:val="Normal"/>
-        <w:bidi w:val="0"/>
-        <w:jc w:val="start"/>
-        <w:rPr>
-          <w:b/>
-          <w:bCs/>
-          <w:sz w:val="52"/>
-          <w:szCs w:val="52"/>
-        </w:rPr>
-      </w:pPr>
-      <w:r>
-        <w:rPr>
-          <w:b/>
-          <w:bCs/>
-          <w:sz w:val="52"/>
-          <w:szCs w:val="52"/>
-        </w:rPr>
-      </w:r>
-    </w:p>
-    <w:p>
-      <w:pPr>
-        <w:pStyle w:val="Normal"/>
-        <w:bidi w:val="0"/>
-        <w:jc w:val="start"/>
-        <w:rPr>
-          <w:b/>
-          <w:bCs/>
-          <w:sz w:val="52"/>
-          <w:szCs w:val="52"/>
-        </w:rPr>
-      </w:pPr>
-      <w:r>
-        <w:rPr>
-          <w:b/>
-          <w:bCs/>
-          <w:sz w:val="52"/>
-          <w:szCs w:val="52"/>
-        </w:rPr>
-      </w:r>
-    </w:p>
-    <w:p>
-      <w:pPr>
-        <w:pStyle w:val="Normal"/>
-        <w:bidi w:val="0"/>
-        <w:jc w:val="start"/>
-        <w:rPr>
-          <w:b/>
-          <w:bCs/>
-          <w:sz w:val="52"/>
-          <w:szCs w:val="52"/>
-        </w:rPr>
-      </w:pPr>
-      <w:r>
-        <w:rPr>
-          <w:b/>
-          <w:bCs/>
-          <w:sz w:val="52"/>
-          <w:szCs w:val="52"/>
-        </w:rPr>
-      </w:r>
-    </w:p>
-    <w:p>
-      <w:pPr>
-        <w:pStyle w:val="Normal"/>
-        <w:bidi w:val="0"/>
-        <w:jc w:val="start"/>
-        <w:rPr>
-          <w:b/>
-          <w:bCs/>
-          <w:sz w:val="52"/>
-          <w:szCs w:val="52"/>
-        </w:rPr>
-      </w:pPr>
-      <w:r>
-        <w:rPr>
-          <w:b/>
-          <w:bCs/>
-          <w:sz w:val="52"/>
-          <w:szCs w:val="52"/>
-        </w:rPr>
-      </w:r>
-    </w:p>
-    <w:p>
-      <w:pPr>
-        <w:pStyle w:val="Normal"/>
-        <w:bidi w:val="0"/>
-        <w:jc w:val="start"/>
-        <w:rPr>
-          <w:b/>
-          <w:bCs/>
-          <w:sz w:val="52"/>
-          <w:szCs w:val="52"/>
-        </w:rPr>
-      </w:pPr>
-      <w:r>
-        <w:rPr>
-          <w:b/>
-          <w:bCs/>
-          <w:sz w:val="52"/>
-          <w:szCs w:val="52"/>
-        </w:rPr>
-      </w:r>
-    </w:p>
-    <w:p>
-      <w:pPr>
-        <w:pStyle w:val="Normal"/>
-        <w:bidi w:val="0"/>
-        <w:jc w:val="start"/>
-        <w:rPr>
-          <w:b/>
-          <w:bCs/>
-          <w:sz w:val="52"/>
-          <w:szCs w:val="52"/>
-        </w:rPr>
-      </w:pPr>
-      <w:r>
-        <w:rPr>
-          <w:b/>
-          <w:bCs/>
-          <w:sz w:val="52"/>
-          <w:szCs w:val="52"/>
-        </w:rPr>
-      </w:r>
-    </w:p>
-    <w:p>
-      <w:pPr>
-        <w:pStyle w:val="Normal"/>
-        <w:bidi w:val="0"/>
-        <w:jc w:val="start"/>
-        <w:rPr>
-          <w:b/>
-          <w:bCs/>
-          <w:sz w:val="52"/>
-          <w:szCs w:val="52"/>
-        </w:rPr>
-      </w:pPr>
-      <w:r>
-        <w:rPr>
-          <w:b/>
-          <w:bCs/>
-          <w:sz w:val="52"/>
-          <w:szCs w:val="52"/>
-        </w:rPr>
-      </w:r>
-    </w:p>
-    <w:p>
-      <w:pPr>
-        <w:pStyle w:val="Normal"/>
-        <w:bidi w:val="0"/>
-        <w:jc w:val="start"/>
-        <w:rPr>
-          <w:b/>
-          <w:bCs/>
-          <w:sz w:val="52"/>
-          <w:szCs w:val="52"/>
-        </w:rPr>
-      </w:pPr>
-      <w:r>
-        <w:rPr>
-          <w:b/>
-          <w:bCs/>
-          <w:sz w:val="52"/>
-          <w:szCs w:val="52"/>
-        </w:rPr>
-      </w:r>
-    </w:p>
-    <w:p>
-      <w:pPr>
-        <w:pStyle w:val="Normal"/>
-        <w:bidi w:val="0"/>
-        <w:jc w:val="start"/>
-        <w:rPr>
-          <w:b/>
-          <w:bCs/>
-          <w:sz w:val="52"/>
-          <w:szCs w:val="52"/>
-        </w:rPr>
-      </w:pPr>
-      <w:r>
-        <w:rPr>
-          <w:b/>
-          <w:bCs/>
-          <w:sz w:val="52"/>
-          <w:szCs w:val="52"/>
-        </w:rPr>
-      </w:r>
-    </w:p>
-    <w:p>
-      <w:pPr>
-        <w:pStyle w:val="Normal"/>
-        <w:bidi w:val="0"/>
-        <w:jc w:val="start"/>
-        <w:rPr>
-          <w:b/>
-          <w:bCs/>
-          <w:sz w:val="52"/>
-          <w:szCs w:val="52"/>
-        </w:rPr>
-      </w:pPr>
-      <w:r>
-        <w:rPr>
-          <w:b/>
-          <w:bCs/>
-          <w:sz w:val="52"/>
-          <w:szCs w:val="52"/>
-        </w:rPr>
-      </w:r>
-    </w:p>
-    <w:p>
-      <w:pPr>
-        <w:pStyle w:val="Normal"/>
-        <w:bidi w:val="0"/>
-        <w:jc w:val="start"/>
-        <w:rPr>
-          <w:b/>
-          <w:bCs/>
-          <w:sz w:val="52"/>
-          <w:szCs w:val="52"/>
-        </w:rPr>
-      </w:pPr>
-      <w:r>
-        <w:rPr>
-          <w:b/>
-          <w:bCs/>
-          <w:sz w:val="52"/>
-          <w:szCs w:val="52"/>
-        </w:rPr>
-      </w:r>
-    </w:p>
-    <w:p>
-      <w:pPr>
-        <w:pStyle w:val="Normal"/>
-        <w:bidi w:val="0"/>
-        <w:jc w:val="start"/>
-        <w:rPr>
-          <w:b/>
-          <w:bCs/>
-          <w:sz w:val="52"/>
-          <w:szCs w:val="52"/>
-        </w:rPr>
-      </w:pPr>
-      <w:r>
-        <w:rPr>
-          <w:b/>
-          <w:bCs/>
-          <w:sz w:val="52"/>
-          <w:szCs w:val="52"/>
-        </w:rPr>
-      </w:r>
-    </w:p>
-    <w:p>
-      <w:pPr>
-        <w:pStyle w:val="Normal"/>
-        <w:bidi w:val="0"/>
-        <w:jc w:val="start"/>
-        <w:rPr>
-          <w:b/>
-          <w:bCs/>
-          <w:sz w:val="52"/>
-          <w:szCs w:val="52"/>
-        </w:rPr>
-      </w:pPr>
-      <w:r>
-        <w:rPr>
-          <w:b/>
-          <w:bCs/>
-          <w:sz w:val="52"/>
-          <w:szCs w:val="52"/>
-        </w:rPr>
-      </w:r>
-    </w:p>
-    <w:p>
-      <w:pPr>
-        <w:pStyle w:val="Normal"/>
-        <w:bidi w:val="0"/>
-        <w:jc w:val="center"/>
-        <w:rPr>
-          <w:b/>
-          <w:bCs/>
-          <w:sz w:val="52"/>
-          <w:szCs w:val="52"/>
-        </w:rPr>
-      </w:pPr>
-      <w:r>
-        <w:fldChar w:fldCharType="begin"/>
-      </w:r>
-      <w:r>
-        <w:rPr>
-          <w:b/>
-          <w:bCs/>
-          <w:sz w:val="52"/>
-          <w:szCs w:val="52"/>
-        </w:rPr>
-        <w:instrText xml:space="preserve"> XE "Bibliografia" \f "Índice personalizado" </w:instrText>
-      </w:r>
-      <w:r>
-        <w:rPr>
-          <w:b/>
-          <w:bCs/>
-          <w:sz w:val="52"/>
-          <w:szCs w:val="52"/>
-        </w:rPr>
-        <w:fldChar w:fldCharType="separate"/>
-      </w:r>
       <w:r>
         <w:rPr>
           <w:b/>
@@ -1926,15 +1897,6 @@
         </w:rPr>
         <w:t>Bibliografia</w:t>
       </w:r>
-      <w:r>
-        <w:rPr>
-          <w:b/>
-          <w:bCs/>
-          <w:sz w:val="52"/>
-          <w:szCs w:val="52"/>
-        </w:rPr>
-        <w:fldChar w:fldCharType="end"/>
-      </w:r>
     </w:p>
     <w:p>
       <w:pPr>
@@ -1959,19 +1921,56 @@
       </w:r>
     </w:p>
     <w:sectPr>
-      <w:footerReference w:type="default" r:id="rId2"/>
+      <w:footerReference w:type="even" r:id="rId2"/>
+      <w:footerReference w:type="default" r:id="rId3"/>
+      <w:footerReference w:type="first" r:id="rId4"/>
       <w:type w:val="nextPage"/>
       <w:pgSz w:w="11906" w:h="16838"/>
       <w:pgMar w:left="1134" w:right="1134" w:gutter="0" w:header="0" w:top="1134" w:footer="1134" w:bottom="1693"/>
       <w:pgNumType w:fmt="decimal"/>
       <w:formProt w:val="false"/>
       <w:textDirection w:val="lrTb"/>
+      <w:docGrid w:type="default" w:linePitch="100" w:charSpace="0"/>
     </w:sectPr>
   </w:body>
 </w:document>
 </file>
 
 <file path=word/footer1.xml><?xml version="1.0" encoding="utf-8"?>
+<w:ftr xmlns:o="urn:schemas-microsoft-com:office:office" xmlns:r="http://schemas.openxmlformats.org/officeDocument/2006/relationships" xmlns:v="urn:schemas-microsoft-com:vml" xmlns:w="http://schemas.openxmlformats.org/wordprocessingml/2006/main" xmlns:w10="urn:schemas-microsoft-com:office:word" xmlns:wp="http://schemas.openxmlformats.org/drawingml/2006/wordprocessingDrawing" xmlns:pic="http://schemas.openxmlformats.org/drawingml/2006/picture" xmlns:wps="http://schemas.microsoft.com/office/word/2010/wordprocessingShape" xmlns:wpg="http://schemas.microsoft.com/office/word/2010/wordprocessingGroup" xmlns:mc="http://schemas.openxmlformats.org/markup-compatibility/2006" xmlns:wp14="http://schemas.microsoft.com/office/word/2010/wordprocessingDrawing" xmlns:w14="http://schemas.microsoft.com/office/word/2010/wordml" xmlns:w15="http://schemas.microsoft.com/office/word/2012/wordml" mc:Ignorable="w14 wp14 w15">
+  <w:p>
+    <w:pPr>
+      <w:pStyle w:val="Footer"/>
+      <w:rPr/>
+    </w:pPr>
+    <w:r>
+      <w:rPr/>
+    </w:r>
+  </w:p>
+</w:ftr>
+</file>
+
+<file path=word/footer2.xml><?xml version="1.0" encoding="utf-8"?>
+<w:ftr xmlns:o="urn:schemas-microsoft-com:office:office" xmlns:r="http://schemas.openxmlformats.org/officeDocument/2006/relationships" xmlns:v="urn:schemas-microsoft-com:vml" xmlns:w="http://schemas.openxmlformats.org/wordprocessingml/2006/main" xmlns:w10="urn:schemas-microsoft-com:office:word" xmlns:wp="http://schemas.openxmlformats.org/drawingml/2006/wordprocessingDrawing" xmlns:pic="http://schemas.openxmlformats.org/drawingml/2006/picture" xmlns:wps="http://schemas.microsoft.com/office/word/2010/wordprocessingShape" xmlns:wpg="http://schemas.microsoft.com/office/word/2010/wordprocessingGroup" xmlns:mc="http://schemas.openxmlformats.org/markup-compatibility/2006" xmlns:wp14="http://schemas.microsoft.com/office/word/2010/wordprocessingDrawing" xmlns:w14="http://schemas.microsoft.com/office/word/2010/wordml" xmlns:w15="http://schemas.microsoft.com/office/word/2012/wordml" mc:Ignorable="w14 wp14 w15">
+  <w:p>
+    <w:pPr>
+      <w:pStyle w:val="Footer"/>
+      <w:bidi w:val="0"/>
+      <w:jc w:val="start"/>
+      <w:rPr/>
+    </w:pPr>
+    <w:r>
+      <w:rPr/>
+      <w:t>08/04/2026</w:t>
+      <w:tab/>
+      <w:tab/>
+      <w:t>Daniel Alvarez y Aketza González</w:t>
+    </w:r>
+  </w:p>
+</w:ftr>
+</file>
+
+<file path=word/footer3.xml><?xml version="1.0" encoding="utf-8"?>
 <w:ftr xmlns:o="urn:schemas-microsoft-com:office:office" xmlns:r="http://schemas.openxmlformats.org/officeDocument/2006/relationships" xmlns:v="urn:schemas-microsoft-com:vml" xmlns:w="http://schemas.openxmlformats.org/wordprocessingml/2006/main" xmlns:w10="urn:schemas-microsoft-com:office:word" xmlns:wp="http://schemas.openxmlformats.org/drawingml/2006/wordprocessingDrawing" xmlns:pic="http://schemas.openxmlformats.org/drawingml/2006/picture" xmlns:wps="http://schemas.microsoft.com/office/word/2010/wordprocessingShape" xmlns:wpg="http://schemas.microsoft.com/office/word/2010/wordprocessingGroup" xmlns:mc="http://schemas.openxmlformats.org/markup-compatibility/2006" xmlns:wp14="http://schemas.microsoft.com/office/word/2010/wordprocessingDrawing" xmlns:w14="http://schemas.microsoft.com/office/word/2010/wordml" xmlns:w15="http://schemas.microsoft.com/office/word/2012/wordml" mc:Ignorable="w14 wp14 w15">
   <w:p>
     <w:pPr>
@@ -1997,7 +1996,6 @@
     <w:lvl w:ilvl="0">
       <w:start w:val="1"/>
       <w:numFmt w:val="none"/>
-      <w:pStyle w:val="Heading1"/>
       <w:suff w:val="nothing"/>
       <w:lvlText w:val=""/>
       <w:lvlJc w:val="start"/>
@@ -2007,6 +2005,7 @@
         </w:tabs>
         <w:ind w:start="0" w:hanging="0"/>
       </w:pPr>
+      <w:rPr/>
     </w:lvl>
     <w:lvl w:ilvl="1">
       <w:start w:val="1"/>
@@ -2020,6 +2019,7 @@
         </w:tabs>
         <w:ind w:start="0" w:hanging="0"/>
       </w:pPr>
+      <w:rPr/>
     </w:lvl>
     <w:lvl w:ilvl="2">
       <w:start w:val="1"/>
@@ -2033,6 +2033,7 @@
         </w:tabs>
         <w:ind w:start="0" w:hanging="0"/>
       </w:pPr>
+      <w:rPr/>
     </w:lvl>
     <w:lvl w:ilvl="3">
       <w:start w:val="1"/>
@@ -2046,6 +2047,7 @@
         </w:tabs>
         <w:ind w:start="0" w:hanging="0"/>
       </w:pPr>
+      <w:rPr/>
     </w:lvl>
     <w:lvl w:ilvl="4">
       <w:start w:val="1"/>
@@ -2059,6 +2061,7 @@
         </w:tabs>
         <w:ind w:start="0" w:hanging="0"/>
       </w:pPr>
+      <w:rPr/>
     </w:lvl>
     <w:lvl w:ilvl="5">
       <w:start w:val="1"/>
@@ -2072,6 +2075,7 @@
         </w:tabs>
         <w:ind w:start="0" w:hanging="0"/>
       </w:pPr>
+      <w:rPr/>
     </w:lvl>
     <w:lvl w:ilvl="6">
       <w:start w:val="1"/>
@@ -2085,6 +2089,7 @@
         </w:tabs>
         <w:ind w:start="0" w:hanging="0"/>
       </w:pPr>
+      <w:rPr/>
     </w:lvl>
     <w:lvl w:ilvl="7">
       <w:start w:val="1"/>
@@ -2098,6 +2103,7 @@
         </w:tabs>
         <w:ind w:start="0" w:hanging="0"/>
       </w:pPr>
+      <w:rPr/>
     </w:lvl>
     <w:lvl w:ilvl="8">
       <w:start w:val="1"/>
@@ -2111,10 +2117,133 @@
         </w:tabs>
         <w:ind w:start="0" w:hanging="0"/>
       </w:pPr>
+      <w:rPr/>
+    </w:lvl>
+  </w:abstractNum>
+  <w:abstractNum w:abstractNumId="2">
+    <w:lvl w:ilvl="0">
+      <w:start w:val="1"/>
+      <w:numFmt w:val="none"/>
+      <w:suff w:val="nothing"/>
+      <w:lvlText w:val=""/>
+      <w:lvlJc w:val="start"/>
+      <w:pPr>
+        <w:tabs>
+          <w:tab w:val="num" w:pos="0"/>
+        </w:tabs>
+        <w:ind w:start="0" w:hanging="0"/>
+      </w:pPr>
+    </w:lvl>
+    <w:lvl w:ilvl="1">
+      <w:start w:val="1"/>
+      <w:numFmt w:val="none"/>
+      <w:suff w:val="nothing"/>
+      <w:lvlText w:val=""/>
+      <w:lvlJc w:val="start"/>
+      <w:pPr>
+        <w:tabs>
+          <w:tab w:val="num" w:pos="0"/>
+        </w:tabs>
+        <w:ind w:start="0" w:hanging="0"/>
+      </w:pPr>
+    </w:lvl>
+    <w:lvl w:ilvl="2">
+      <w:start w:val="1"/>
+      <w:numFmt w:val="none"/>
+      <w:suff w:val="nothing"/>
+      <w:lvlText w:val=""/>
+      <w:lvlJc w:val="start"/>
+      <w:pPr>
+        <w:tabs>
+          <w:tab w:val="num" w:pos="0"/>
+        </w:tabs>
+        <w:ind w:start="0" w:hanging="0"/>
+      </w:pPr>
+    </w:lvl>
+    <w:lvl w:ilvl="3">
+      <w:start w:val="1"/>
+      <w:numFmt w:val="none"/>
+      <w:suff w:val="nothing"/>
+      <w:lvlText w:val=""/>
+      <w:lvlJc w:val="start"/>
+      <w:pPr>
+        <w:tabs>
+          <w:tab w:val="num" w:pos="0"/>
+        </w:tabs>
+        <w:ind w:start="0" w:hanging="0"/>
+      </w:pPr>
+    </w:lvl>
+    <w:lvl w:ilvl="4">
+      <w:start w:val="1"/>
+      <w:numFmt w:val="none"/>
+      <w:suff w:val="nothing"/>
+      <w:lvlText w:val=""/>
+      <w:lvlJc w:val="start"/>
+      <w:pPr>
+        <w:tabs>
+          <w:tab w:val="num" w:pos="0"/>
+        </w:tabs>
+        <w:ind w:start="0" w:hanging="0"/>
+      </w:pPr>
+    </w:lvl>
+    <w:lvl w:ilvl="5">
+      <w:start w:val="1"/>
+      <w:numFmt w:val="none"/>
+      <w:suff w:val="nothing"/>
+      <w:lvlText w:val=""/>
+      <w:lvlJc w:val="start"/>
+      <w:pPr>
+        <w:tabs>
+          <w:tab w:val="num" w:pos="0"/>
+        </w:tabs>
+        <w:ind w:start="0" w:hanging="0"/>
+      </w:pPr>
+    </w:lvl>
+    <w:lvl w:ilvl="6">
+      <w:start w:val="1"/>
+      <w:numFmt w:val="none"/>
+      <w:suff w:val="nothing"/>
+      <w:lvlText w:val=""/>
+      <w:lvlJc w:val="start"/>
+      <w:pPr>
+        <w:tabs>
+          <w:tab w:val="num" w:pos="0"/>
+        </w:tabs>
+        <w:ind w:start="0" w:hanging="0"/>
+      </w:pPr>
+    </w:lvl>
+    <w:lvl w:ilvl="7">
+      <w:start w:val="1"/>
+      <w:numFmt w:val="none"/>
+      <w:suff w:val="nothing"/>
+      <w:lvlText w:val=""/>
+      <w:lvlJc w:val="start"/>
+      <w:pPr>
+        <w:tabs>
+          <w:tab w:val="num" w:pos="0"/>
+        </w:tabs>
+        <w:ind w:start="0" w:hanging="0"/>
+      </w:pPr>
+    </w:lvl>
+    <w:lvl w:ilvl="8">
+      <w:start w:val="1"/>
+      <w:numFmt w:val="none"/>
+      <w:suff w:val="nothing"/>
+      <w:lvlText w:val=""/>
+      <w:lvlJc w:val="start"/>
+      <w:pPr>
+        <w:tabs>
+          <w:tab w:val="num" w:pos="0"/>
+        </w:tabs>
+        <w:ind w:start="0" w:hanging="0"/>
+      </w:pPr>
     </w:lvl>
   </w:abstractNum>
   <w:num w:numId="1">
     <w:abstractNumId w:val="1"/>
+  </w:num>
+  <w:num w:numId="2">
+    <w:abstractNumId w:val="2"/>
   </w:num>
 </w:numbering>
 </file>
@@ -2133,7 +2262,6 @@
     </w:rPrDefault>
     <w:pPrDefault>
       <w:pPr>
-        <w:widowControl/>
         <w:suppressAutoHyphens w:val="true"/>
       </w:pPr>
     </w:pPrDefault>
@@ -2143,7 +2271,10 @@
     <w:qFormat/>
     <w:pPr>
       <w:widowControl/>
+      <w:suppressAutoHyphens w:val="true"/>
       <w:bidi w:val="0"/>
+      <w:spacing w:before="0" w:after="0"/>
+      <w:jc w:val="start"/>
     </w:pPr>
     <w:rPr>
       <w:rFonts w:ascii="Liberation Serif" w:hAnsi="Liberation Serif" w:eastAsia="NSimSun" w:cs="Arial"/>
@@ -2156,7 +2287,7 @@
   </w:style>
   <w:style w:type="paragraph" w:styleId="Heading1">
     <w:name w:val="heading 1"/>
-    <w:basedOn w:val="Ttulo"/>
+    <w:basedOn w:val="Ttulouser"/>
     <w:next w:val="BodyText"/>
     <w:qFormat/>
     <w:pPr>
@@ -2232,8 +2363,34 @@
       <w:rFonts w:cs="Arial"/>
     </w:rPr>
   </w:style>
-  <w:style w:type="paragraph" w:styleId="Cabeceraypie">
-    <w:name w:val="Cabecera y pie"/>
+  <w:style w:type="paragraph" w:styleId="Ttulouser">
+    <w:name w:val="Título (user)"/>
+    <w:basedOn w:val="Normal"/>
+    <w:next w:val="BodyText"/>
+    <w:qFormat/>
+    <w:pPr>
+      <w:keepNext w:val="true"/>
+      <w:spacing w:before="240" w:after="120"/>
+    </w:pPr>
+    <w:rPr>
+      <w:rFonts w:ascii="Liberation Sans" w:hAnsi="Liberation Sans" w:eastAsia="Microsoft YaHei" w:cs="Arial"/>
+      <w:sz w:val="28"/>
+      <w:szCs w:val="28"/>
+    </w:rPr>
+  </w:style>
+  <w:style w:type="paragraph" w:styleId="ndiceuser">
+    <w:name w:val="Índice (user)"/>
+    <w:basedOn w:val="Normal"/>
+    <w:qFormat/>
+    <w:pPr>
+      <w:suppressLineNumbers/>
+    </w:pPr>
+    <w:rPr>
+      <w:rFonts w:cs="Arial"/>
+    </w:rPr>
+  </w:style>
+  <w:style w:type="paragraph" w:styleId="Cabeceraypieuser">
+    <w:name w:val="Cabecera y pie (user)"/>
     <w:basedOn w:val="Normal"/>
     <w:qFormat/>
     <w:pPr>
@@ -2246,9 +2403,16 @@
     </w:pPr>
     <w:rPr/>
   </w:style>
+  <w:style w:type="paragraph" w:styleId="Cabeceraypie">
+    <w:name w:val="Cabecera y pie"/>
+    <w:basedOn w:val="Normal"/>
+    <w:qFormat/>
+    <w:pPr/>
+    <w:rPr/>
+  </w:style>
   <w:style w:type="paragraph" w:styleId="Footer">
     <w:name w:val="footer"/>
-    <w:basedOn w:val="Cabeceraypie"/>
+    <w:basedOn w:val="Cabeceraypieuser"/>
     <w:pPr>
       <w:suppressLineNumbers/>
     </w:pPr>
@@ -2256,7 +2420,7 @@
   </w:style>
   <w:style w:type="paragraph" w:styleId="IndexHeading">
     <w:name w:val="index heading"/>
-    <w:basedOn w:val="Ttulo"/>
+    <w:basedOn w:val="Ttulouser"/>
     <w:pPr>
       <w:suppressLineNumbers/>
       <w:ind w:hanging="0" w:start="0"/>
@@ -2268,8 +2432,8 @@
       <w:szCs w:val="32"/>
     </w:rPr>
   </w:style>
-  <w:style w:type="paragraph" w:styleId="Ttulodelndicedeusuario">
-    <w:name w:val="Título del índice de usuario"/>
+  <w:style w:type="paragraph" w:styleId="Ttulodelndicedeusuariouser">
+    <w:name w:val="Título del índice de usuario (user)"/>
     <w:basedOn w:val="IndexHeading"/>
     <w:qFormat/>
     <w:pPr>
@@ -2283,9 +2447,9 @@
       <w:szCs w:val="32"/>
     </w:rPr>
   </w:style>
-  <w:style w:type="paragraph" w:styleId="ndicedeusuario1">
-    <w:name w:val="Índice de usuario 1"/>
-    <w:basedOn w:val="ndice"/>
+  <w:style w:type="paragraph" w:styleId="ndicedeusuario1user">
+    <w:name w:val="Índice de usuario 1 (user)"/>
+    <w:basedOn w:val="ndiceuser"/>
     <w:qFormat/>
     <w:pPr>
       <w:tabs>

</xml_diff>

<commit_message>
actualizado manual de usuario
</commit_message>
<xml_diff>
--- a/DOCUMENTACION/Manual_de_usuario.docx
+++ b/DOCUMENTACION/Manual_de_usuario.docx
@@ -8,6 +8,26 @@
         <w:bidi w:val="0"/>
         <w:jc w:val="center"/>
         <w:rPr>
+          <w:sz w:val="84"/>
+          <w:szCs w:val="84"/>
+        </w:rPr>
+      </w:pPr>
+      <w:r>
+        <w:rPr>
+          <w:b/>
+          <w:bCs/>
+          <w:sz w:val="84"/>
+          <w:szCs w:val="84"/>
+        </w:rPr>
+        <w:t>MANUAL DE USUARIO DE BLANCONOMICON</w:t>
+      </w:r>
+    </w:p>
+    <w:p>
+      <w:pPr>
+        <w:pStyle w:val="Normal"/>
+        <w:bidi w:val="0"/>
+        <w:jc w:val="center"/>
+        <w:rPr>
           <w:b/>
           <w:bCs/>
           <w:sz w:val="72"/>
@@ -21,7 +41,6 @@
           <w:sz w:val="72"/>
           <w:szCs w:val="72"/>
         </w:rPr>
-        <w:t>MANUAL DE USUARIO DE BLANCONOMICON</w:t>
       </w:r>
     </w:p>
     <w:p>
@@ -305,16 +324,16 @@
         <w:rPr>
           <w:b/>
           <w:bCs/>
-          <w:sz w:val="72"/>
-          <w:szCs w:val="72"/>
-        </w:rPr>
-      </w:pPr>
-      <w:r>
-        <w:rPr>
-          <w:b/>
-          <w:bCs/>
-          <w:sz w:val="72"/>
-          <w:szCs w:val="72"/>
+          <w:sz w:val="52"/>
+          <w:szCs w:val="52"/>
+        </w:rPr>
+      </w:pPr>
+      <w:r>
+        <w:rPr>
+          <w:b/>
+          <w:bCs/>
+          <w:sz w:val="52"/>
+          <w:szCs w:val="52"/>
         </w:rPr>
       </w:r>
     </w:p>
@@ -324,46 +343,23 @@
         <w:bidi w:val="0"/>
         <w:jc w:val="center"/>
         <w:rPr>
-          <w:b/>
-          <w:bCs/>
-          <w:sz w:val="52"/>
-          <w:szCs w:val="52"/>
-        </w:rPr>
-      </w:pPr>
-      <w:r>
-        <w:rPr>
-          <w:b/>
-          <w:bCs/>
-          <w:sz w:val="52"/>
-          <w:szCs w:val="52"/>
-        </w:rPr>
-      </w:r>
-    </w:p>
-    <w:p>
-      <w:pPr>
-        <w:pStyle w:val="Normal"/>
-        <w:bidi w:val="0"/>
-        <w:jc w:val="center"/>
-        <w:rPr>
-          <w:b/>
-          <w:bCs/>
-          <w:sz w:val="52"/>
-          <w:szCs w:val="52"/>
-        </w:rPr>
-      </w:pPr>
-      <w:r>
-        <w:rPr>
-          <w:b/>
-          <w:bCs/>
-          <w:sz w:val="52"/>
-          <w:szCs w:val="52"/>
+          <w:sz w:val="64"/>
+          <w:szCs w:val="64"/>
+        </w:rPr>
+      </w:pPr>
+      <w:r>
+        <w:rPr>
+          <w:b/>
+          <w:bCs/>
+          <w:sz w:val="64"/>
+          <w:szCs w:val="64"/>
         </w:rPr>
         <w:t>Indice</w:t>
       </w:r>
     </w:p>
     <w:p>
       <w:pPr>
-        <w:pStyle w:val="Ttulodelndicedeusuariouser"/>
+        <w:pStyle w:val="Ttulodelndicedeusuario"/>
         <w:suppressLineNumbers/>
         <w:bidi w:val="0"/>
         <w:ind w:hanging="0" w:start="0"/>
@@ -377,13 +373,11 @@
     </w:p>
     <w:p>
       <w:pPr>
-        <w:pStyle w:val="ndicedeusuario1user"/>
+        <w:pStyle w:val="ndicedeusuario1"/>
         <w:tabs>
           <w:tab w:val="clear" w:pos="9638"/>
           <w:tab w:val="right" w:pos="9637" w:leader="dot"/>
         </w:tabs>
-        <w:bidi w:val="0"/>
-        <w:jc w:val="start"/>
         <w:rPr/>
       </w:pPr>
       <w:r>
@@ -408,31 +402,59 @@
     </w:p>
     <w:p>
       <w:pPr>
-        <w:pStyle w:val="ndicedeusuario1user"/>
+        <w:pStyle w:val="ndicedeusuario1"/>
         <w:tabs>
           <w:tab w:val="clear" w:pos="9638"/>
           <w:tab w:val="right" w:pos="9637" w:leader="dot"/>
         </w:tabs>
-        <w:bidi w:val="0"/>
-        <w:jc w:val="start"/>
         <w:rPr/>
       </w:pPr>
       <w:r>
         <w:rPr/>
         <w:t>Desarrollo</w:t>
         <w:tab/>
+        <w:t>3</w:t>
+      </w:r>
+    </w:p>
+    <w:p>
+      <w:pPr>
+        <w:pStyle w:val="ndicedeusuario2"/>
+        <w:tabs>
+          <w:tab w:val="clear" w:pos="9355"/>
+          <w:tab w:val="right" w:pos="9637" w:leader="dot"/>
+        </w:tabs>
+        <w:rPr/>
+      </w:pPr>
+      <w:r>
+        <w:rPr/>
+        <w:t>Login</w:t>
+        <w:tab/>
         <w:t>4</w:t>
       </w:r>
     </w:p>
     <w:p>
       <w:pPr>
-        <w:pStyle w:val="ndicedeusuario1user"/>
+        <w:pStyle w:val="ndicedeusuario2"/>
+        <w:tabs>
+          <w:tab w:val="clear" w:pos="9355"/>
+          <w:tab w:val="right" w:pos="9637" w:leader="dot"/>
+        </w:tabs>
+        <w:rPr/>
+      </w:pPr>
+      <w:r>
+        <w:rPr/>
+        <w:t>Registrarse</w:t>
+        <w:tab/>
+        <w:t>4</w:t>
+      </w:r>
+    </w:p>
+    <w:p>
+      <w:pPr>
+        <w:pStyle w:val="ndicedeusuario1"/>
         <w:tabs>
           <w:tab w:val="clear" w:pos="9638"/>
           <w:tab w:val="right" w:pos="9637" w:leader="dot"/>
         </w:tabs>
-        <w:bidi w:val="0"/>
-        <w:jc w:val="start"/>
         <w:rPr/>
       </w:pPr>
       <w:r>
@@ -828,90 +850,6 @@
       <w:pPr>
         <w:pStyle w:val="Normal"/>
         <w:bidi w:val="0"/>
-        <w:jc w:val="start"/>
-        <w:rPr>
-          <w:b/>
-          <w:bCs/>
-          <w:sz w:val="52"/>
-          <w:szCs w:val="52"/>
-        </w:rPr>
-      </w:pPr>
-      <w:r>
-        <w:rPr>
-          <w:b/>
-          <w:bCs/>
-          <w:sz w:val="52"/>
-          <w:szCs w:val="52"/>
-        </w:rPr>
-      </w:r>
-    </w:p>
-    <w:p>
-      <w:pPr>
-        <w:pStyle w:val="Normal"/>
-        <w:bidi w:val="0"/>
-        <w:jc w:val="start"/>
-        <w:rPr>
-          <w:b/>
-          <w:bCs/>
-          <w:sz w:val="52"/>
-          <w:szCs w:val="52"/>
-        </w:rPr>
-      </w:pPr>
-      <w:r>
-        <w:rPr>
-          <w:b/>
-          <w:bCs/>
-          <w:sz w:val="52"/>
-          <w:szCs w:val="52"/>
-        </w:rPr>
-      </w:r>
-    </w:p>
-    <w:p>
-      <w:pPr>
-        <w:pStyle w:val="Normal"/>
-        <w:bidi w:val="0"/>
-        <w:jc w:val="start"/>
-        <w:rPr>
-          <w:b/>
-          <w:bCs/>
-          <w:sz w:val="52"/>
-          <w:szCs w:val="52"/>
-        </w:rPr>
-      </w:pPr>
-      <w:r>
-        <w:rPr>
-          <w:b/>
-          <w:bCs/>
-          <w:sz w:val="52"/>
-          <w:szCs w:val="52"/>
-        </w:rPr>
-      </w:r>
-    </w:p>
-    <w:p>
-      <w:pPr>
-        <w:pStyle w:val="Normal"/>
-        <w:bidi w:val="0"/>
-        <w:jc w:val="start"/>
-        <w:rPr>
-          <w:b/>
-          <w:bCs/>
-          <w:sz w:val="52"/>
-          <w:szCs w:val="52"/>
-        </w:rPr>
-      </w:pPr>
-      <w:r>
-        <w:rPr>
-          <w:b/>
-          <w:bCs/>
-          <w:sz w:val="52"/>
-          <w:szCs w:val="52"/>
-        </w:rPr>
-      </w:r>
-    </w:p>
-    <w:p>
-      <w:pPr>
-        <w:pStyle w:val="Normal"/>
-        <w:bidi w:val="0"/>
         <w:jc w:val="center"/>
         <w:rPr>
           <w:b/>
@@ -968,8 +906,8 @@
         <w:rPr>
           <w:b/>
           <w:bCs/>
-          <w:sz w:val="52"/>
-          <w:szCs w:val="52"/>
+          <w:sz w:val="64"/>
+          <w:szCs w:val="64"/>
           <w:shd w:fill="auto" w:val="clear"/>
         </w:rPr>
         <w:t>Introducción</w:t>
@@ -1390,8 +1328,8 @@
         <w:rPr>
           <w:b/>
           <w:bCs/>
-          <w:sz w:val="52"/>
-          <w:szCs w:val="52"/>
+          <w:sz w:val="64"/>
+          <w:szCs w:val="64"/>
         </w:rPr>
         <w:t>Desarrollo</w:t>
       </w:r>
@@ -1402,439 +1340,14 @@
         <w:bidi w:val="0"/>
         <w:jc w:val="start"/>
         <w:rPr>
-          <w:b/>
-          <w:bCs/>
-          <w:sz w:val="52"/>
-          <w:szCs w:val="52"/>
-        </w:rPr>
-      </w:pPr>
-      <w:r>
-        <w:rPr>
-          <w:b/>
-          <w:bCs/>
-          <w:sz w:val="52"/>
-          <w:szCs w:val="52"/>
-        </w:rPr>
-        <w:t>TODO AÑADIR EL DESARROLLO DEL MANUAL</w:t>
-      </w:r>
-    </w:p>
-    <w:p>
-      <w:pPr>
-        <w:pStyle w:val="Normal"/>
-        <w:bidi w:val="0"/>
-        <w:jc w:val="start"/>
-        <w:rPr>
-          <w:b/>
-          <w:bCs/>
-          <w:sz w:val="52"/>
-          <w:szCs w:val="52"/>
-        </w:rPr>
-      </w:pPr>
-      <w:r>
-        <w:rPr>
-          <w:b/>
-          <w:bCs/>
-          <w:sz w:val="52"/>
-          <w:szCs w:val="52"/>
-        </w:rPr>
-      </w:r>
-    </w:p>
-    <w:p>
-      <w:pPr>
-        <w:pStyle w:val="Normal"/>
-        <w:bidi w:val="0"/>
-        <w:jc w:val="start"/>
-        <w:rPr>
-          <w:b/>
-          <w:bCs/>
-          <w:sz w:val="52"/>
-          <w:szCs w:val="52"/>
-        </w:rPr>
-      </w:pPr>
-      <w:r>
-        <w:rPr>
-          <w:b/>
-          <w:bCs/>
-          <w:sz w:val="52"/>
-          <w:szCs w:val="52"/>
-        </w:rPr>
-      </w:r>
-    </w:p>
-    <w:p>
-      <w:pPr>
-        <w:pStyle w:val="Normal"/>
-        <w:bidi w:val="0"/>
-        <w:jc w:val="start"/>
-        <w:rPr>
-          <w:b/>
-          <w:bCs/>
-          <w:sz w:val="52"/>
-          <w:szCs w:val="52"/>
-        </w:rPr>
-      </w:pPr>
-      <w:r>
-        <w:rPr>
-          <w:b/>
-          <w:bCs/>
-          <w:sz w:val="52"/>
-          <w:szCs w:val="52"/>
-        </w:rPr>
-      </w:r>
-    </w:p>
-    <w:p>
-      <w:pPr>
-        <w:pStyle w:val="Normal"/>
-        <w:bidi w:val="0"/>
-        <w:jc w:val="start"/>
-        <w:rPr>
-          <w:b/>
-          <w:bCs/>
-          <w:sz w:val="52"/>
-          <w:szCs w:val="52"/>
-        </w:rPr>
-      </w:pPr>
-      <w:r>
-        <w:rPr>
-          <w:b/>
-          <w:bCs/>
-          <w:sz w:val="52"/>
-          <w:szCs w:val="52"/>
-        </w:rPr>
-      </w:r>
-    </w:p>
-    <w:p>
-      <w:pPr>
-        <w:pStyle w:val="Normal"/>
-        <w:bidi w:val="0"/>
-        <w:jc w:val="start"/>
-        <w:rPr>
-          <w:b/>
-          <w:bCs/>
-          <w:sz w:val="52"/>
-          <w:szCs w:val="52"/>
-        </w:rPr>
-      </w:pPr>
-      <w:r>
-        <w:rPr>
-          <w:b/>
-          <w:bCs/>
-          <w:sz w:val="52"/>
-          <w:szCs w:val="52"/>
-        </w:rPr>
-      </w:r>
-    </w:p>
-    <w:p>
-      <w:pPr>
-        <w:pStyle w:val="Normal"/>
-        <w:bidi w:val="0"/>
-        <w:jc w:val="start"/>
-        <w:rPr>
-          <w:b/>
-          <w:bCs/>
-          <w:sz w:val="52"/>
-          <w:szCs w:val="52"/>
-        </w:rPr>
-      </w:pPr>
-      <w:r>
-        <w:rPr>
-          <w:b/>
-          <w:bCs/>
-          <w:sz w:val="52"/>
-          <w:szCs w:val="52"/>
-        </w:rPr>
-      </w:r>
-    </w:p>
-    <w:p>
-      <w:pPr>
-        <w:pStyle w:val="Normal"/>
-        <w:bidi w:val="0"/>
-        <w:jc w:val="start"/>
-        <w:rPr>
-          <w:b/>
-          <w:bCs/>
-          <w:sz w:val="52"/>
-          <w:szCs w:val="52"/>
-        </w:rPr>
-      </w:pPr>
-      <w:r>
-        <w:rPr>
-          <w:b/>
-          <w:bCs/>
-          <w:sz w:val="52"/>
-          <w:szCs w:val="52"/>
-        </w:rPr>
-      </w:r>
-    </w:p>
-    <w:p>
-      <w:pPr>
-        <w:pStyle w:val="Normal"/>
-        <w:bidi w:val="0"/>
-        <w:jc w:val="start"/>
-        <w:rPr>
-          <w:b/>
-          <w:bCs/>
-          <w:sz w:val="52"/>
-          <w:szCs w:val="52"/>
-        </w:rPr>
-      </w:pPr>
-      <w:r>
-        <w:rPr>
-          <w:b/>
-          <w:bCs/>
-          <w:sz w:val="52"/>
-          <w:szCs w:val="52"/>
-        </w:rPr>
-      </w:r>
-    </w:p>
-    <w:p>
-      <w:pPr>
-        <w:pStyle w:val="Normal"/>
-        <w:bidi w:val="0"/>
-        <w:jc w:val="start"/>
-        <w:rPr>
-          <w:b/>
-          <w:bCs/>
-          <w:sz w:val="52"/>
-          <w:szCs w:val="52"/>
-        </w:rPr>
-      </w:pPr>
-      <w:r>
-        <w:rPr>
-          <w:b/>
-          <w:bCs/>
-          <w:sz w:val="52"/>
-          <w:szCs w:val="52"/>
-        </w:rPr>
-      </w:r>
-    </w:p>
-    <w:p>
-      <w:pPr>
-        <w:pStyle w:val="Normal"/>
-        <w:bidi w:val="0"/>
-        <w:jc w:val="start"/>
-        <w:rPr>
-          <w:b/>
-          <w:bCs/>
-          <w:sz w:val="52"/>
-          <w:szCs w:val="52"/>
-        </w:rPr>
-      </w:pPr>
-      <w:r>
-        <w:rPr>
-          <w:b/>
-          <w:bCs/>
-          <w:sz w:val="52"/>
-          <w:szCs w:val="52"/>
-        </w:rPr>
-      </w:r>
-    </w:p>
-    <w:p>
-      <w:pPr>
-        <w:pStyle w:val="Normal"/>
-        <w:bidi w:val="0"/>
-        <w:jc w:val="start"/>
-        <w:rPr>
-          <w:b/>
-          <w:bCs/>
-          <w:sz w:val="52"/>
-          <w:szCs w:val="52"/>
-        </w:rPr>
-      </w:pPr>
-      <w:r>
-        <w:rPr>
-          <w:b/>
-          <w:bCs/>
-          <w:sz w:val="52"/>
-          <w:szCs w:val="52"/>
-        </w:rPr>
-      </w:r>
-    </w:p>
-    <w:p>
-      <w:pPr>
-        <w:pStyle w:val="Normal"/>
-        <w:bidi w:val="0"/>
-        <w:jc w:val="start"/>
-        <w:rPr>
-          <w:b/>
-          <w:bCs/>
-          <w:sz w:val="52"/>
-          <w:szCs w:val="52"/>
-        </w:rPr>
-      </w:pPr>
-      <w:r>
-        <w:rPr>
-          <w:b/>
-          <w:bCs/>
-          <w:sz w:val="52"/>
-          <w:szCs w:val="52"/>
-        </w:rPr>
-      </w:r>
-    </w:p>
-    <w:p>
-      <w:pPr>
-        <w:pStyle w:val="Normal"/>
-        <w:bidi w:val="0"/>
-        <w:jc w:val="start"/>
-        <w:rPr>
-          <w:b/>
-          <w:bCs/>
-          <w:sz w:val="52"/>
-          <w:szCs w:val="52"/>
-        </w:rPr>
-      </w:pPr>
-      <w:r>
-        <w:rPr>
-          <w:b/>
-          <w:bCs/>
-          <w:sz w:val="52"/>
-          <w:szCs w:val="52"/>
-        </w:rPr>
-      </w:r>
-    </w:p>
-    <w:p>
-      <w:pPr>
-        <w:pStyle w:val="Normal"/>
-        <w:bidi w:val="0"/>
-        <w:jc w:val="start"/>
-        <w:rPr>
-          <w:b/>
-          <w:bCs/>
-          <w:sz w:val="52"/>
-          <w:szCs w:val="52"/>
-        </w:rPr>
-      </w:pPr>
-      <w:r>
-        <w:rPr>
-          <w:b/>
-          <w:bCs/>
-          <w:sz w:val="52"/>
-          <w:szCs w:val="52"/>
-        </w:rPr>
-      </w:r>
-    </w:p>
-    <w:p>
-      <w:pPr>
-        <w:pStyle w:val="Normal"/>
-        <w:bidi w:val="0"/>
-        <w:jc w:val="start"/>
-        <w:rPr>
-          <w:b/>
-          <w:bCs/>
-          <w:sz w:val="52"/>
-          <w:szCs w:val="52"/>
-        </w:rPr>
-      </w:pPr>
-      <w:r>
-        <w:rPr>
-          <w:b/>
-          <w:bCs/>
-          <w:sz w:val="52"/>
-          <w:szCs w:val="52"/>
-        </w:rPr>
-      </w:r>
-    </w:p>
-    <w:p>
-      <w:pPr>
-        <w:pStyle w:val="Normal"/>
-        <w:bidi w:val="0"/>
-        <w:jc w:val="start"/>
-        <w:rPr>
-          <w:b/>
-          <w:bCs/>
-          <w:sz w:val="52"/>
-          <w:szCs w:val="52"/>
-        </w:rPr>
-      </w:pPr>
-      <w:r>
-        <w:rPr>
-          <w:b/>
-          <w:bCs/>
-          <w:sz w:val="52"/>
-          <w:szCs w:val="52"/>
-        </w:rPr>
-      </w:r>
-    </w:p>
-    <w:p>
-      <w:pPr>
-        <w:pStyle w:val="Normal"/>
-        <w:bidi w:val="0"/>
-        <w:jc w:val="start"/>
-        <w:rPr>
-          <w:b/>
-          <w:bCs/>
-          <w:sz w:val="52"/>
-          <w:szCs w:val="52"/>
-        </w:rPr>
-      </w:pPr>
-      <w:r>
-        <w:rPr>
-          <w:b/>
-          <w:bCs/>
-          <w:sz w:val="52"/>
-          <w:szCs w:val="52"/>
-        </w:rPr>
-      </w:r>
-    </w:p>
-    <w:p>
-      <w:pPr>
-        <w:pStyle w:val="Normal"/>
-        <w:bidi w:val="0"/>
-        <w:jc w:val="start"/>
-        <w:rPr>
-          <w:b/>
-          <w:bCs/>
-          <w:sz w:val="52"/>
-          <w:szCs w:val="52"/>
-        </w:rPr>
-      </w:pPr>
-      <w:r>
-        <w:rPr>
-          <w:b/>
-          <w:bCs/>
-          <w:sz w:val="52"/>
-          <w:szCs w:val="52"/>
-        </w:rPr>
-      </w:r>
-    </w:p>
-    <w:p>
-      <w:pPr>
-        <w:pStyle w:val="Normal"/>
-        <w:bidi w:val="0"/>
-        <w:jc w:val="start"/>
-        <w:rPr>
-          <w:b/>
-          <w:bCs/>
-          <w:sz w:val="52"/>
-          <w:szCs w:val="52"/>
-        </w:rPr>
-      </w:pPr>
-      <w:r>
-        <w:rPr>
-          <w:b/>
-          <w:bCs/>
-          <w:sz w:val="52"/>
-          <w:szCs w:val="52"/>
-        </w:rPr>
-      </w:r>
-    </w:p>
-    <w:p>
-      <w:pPr>
-        <w:pStyle w:val="Normal"/>
-        <w:bidi w:val="0"/>
-        <w:jc w:val="start"/>
-        <w:rPr>
-          <w:b/>
-          <w:bCs/>
-          <w:sz w:val="52"/>
-          <w:szCs w:val="52"/>
-        </w:rPr>
-      </w:pPr>
-      <w:r>
-        <w:rPr>
-          <w:b/>
-          <w:bCs/>
-          <w:sz w:val="52"/>
-          <w:szCs w:val="52"/>
+          <w:sz w:val="40"/>
+          <w:szCs w:val="40"/>
+        </w:rPr>
+      </w:pPr>
+      <w:r>
+        <w:rPr>
+          <w:sz w:val="40"/>
+          <w:szCs w:val="40"/>
         </w:rPr>
       </w:r>
     </w:p>
@@ -1846,8 +1359,8 @@
         <w:rPr>
           <w:b/>
           <w:bCs/>
-          <w:sz w:val="52"/>
-          <w:szCs w:val="52"/>
+          <w:sz w:val="44"/>
+          <w:szCs w:val="44"/>
         </w:rPr>
       </w:pPr>
       <w:r>
@@ -1857,6 +1370,1250 @@
         <w:rPr>
           <w:b/>
           <w:bCs/>
+          <w:sz w:val="44"/>
+          <w:szCs w:val="44"/>
+        </w:rPr>
+        <w:instrText xml:space="preserve"> XE "Login" \f "Índice personalizado" </w:instrText>
+      </w:r>
+      <w:r>
+        <w:rPr>
+          <w:b/>
+          <w:bCs/>
+          <w:sz w:val="44"/>
+          <w:szCs w:val="44"/>
+        </w:rPr>
+        <w:fldChar w:fldCharType="separate"/>
+      </w:r>
+      <w:r>
+        <w:rPr>
+          <w:b/>
+          <w:bCs/>
+          <w:sz w:val="44"/>
+          <w:szCs w:val="44"/>
+        </w:rPr>
+        <w:t>Login</w:t>
+      </w:r>
+      <w:r>
+        <w:rPr>
+          <w:b/>
+          <w:bCs/>
+          <w:sz w:val="44"/>
+          <w:szCs w:val="44"/>
+        </w:rPr>
+        <w:fldChar w:fldCharType="end"/>
+      </w:r>
+    </w:p>
+    <w:p>
+      <w:pPr>
+        <w:pStyle w:val="Normal"/>
+        <w:bidi w:val="0"/>
+        <w:jc w:val="center"/>
+        <w:rPr/>
+      </w:pPr>
+      <w:r>
+        <w:fldChar w:fldCharType="begin"/>
+      </w:r>
+      <w:r>
+        <w:rPr>
+          <w:b/>
+          <w:bCs/>
+          <w:sz w:val="44"/>
+          <w:szCs w:val="44"/>
+        </w:rPr>
+        <w:instrText xml:space="preserve"> XE "" \f "Índice personalizado" </w:instrText>
+      </w:r>
+      <w:r>
+        <w:rPr>
+          <w:b/>
+          <w:bCs/>
+          <w:sz w:val="44"/>
+          <w:szCs w:val="44"/>
+        </w:rPr>
+        <w:fldChar w:fldCharType="separate"/>
+      </w:r>
+      <w:r>
+        <w:rPr>
+          <w:b/>
+          <w:bCs/>
+          <w:sz w:val="44"/>
+          <w:szCs w:val="44"/>
+        </w:rPr>
+      </w:r>
+      <w:r>
+        <w:rPr>
+          <w:b/>
+          <w:bCs/>
+          <w:sz w:val="44"/>
+          <w:szCs w:val="44"/>
+        </w:rPr>
+        <w:fldChar w:fldCharType="end"/>
+      </w:r>
+    </w:p>
+    <w:p>
+      <w:pPr>
+        <w:pStyle w:val="Normal"/>
+        <w:bidi w:val="0"/>
+        <w:jc w:val="start"/>
+        <w:rPr/>
+      </w:pPr>
+      <w:r>
+        <w:fldChar w:fldCharType="begin"/>
+      </w:r>
+      <w:r>
+        <w:rPr>
+          <w:b/>
+          <w:bCs/>
+          <w:sz w:val="36"/>
+          <w:szCs w:val="36"/>
+        </w:rPr>
+        <w:instrText xml:space="preserve"> XE "" \f "Índice personalizado" </w:instrText>
+      </w:r>
+      <w:r>
+        <w:rPr>
+          <w:b/>
+          <w:bCs/>
+          <w:sz w:val="36"/>
+          <w:szCs w:val="36"/>
+        </w:rPr>
+        <w:fldChar w:fldCharType="separate"/>
+      </w:r>
+      <w:r>
+        <w:rPr>
+          <w:b/>
+          <w:bCs/>
+          <w:sz w:val="36"/>
+          <w:szCs w:val="36"/>
+        </w:rPr>
+        <w:drawing>
+          <wp:anchor distT="0" distB="0" distL="0" distR="0" simplePos="0" relativeHeight="2" behindDoc="0" locked="0" layoutInCell="0" allowOverlap="1">
+            <wp:simplePos x="0" y="0"/>
+            <wp:positionH relativeFrom="column">
+              <wp:align>center</wp:align>
+            </wp:positionH>
+            <wp:positionV relativeFrom="paragraph">
+              <wp:posOffset>635</wp:posOffset>
+            </wp:positionV>
+            <wp:extent cx="6120130" cy="2767965"/>
+            <wp:effectExtent l="0" t="0" r="0" b="0"/>
+            <wp:wrapSquare wrapText="largest"/>
+            <wp:docPr id="1" name="Imagen1"/>
+            <wp:cNvGraphicFramePr>
+              <a:graphicFrameLocks xmlns:a="http://schemas.openxmlformats.org/drawingml/2006/main" noChangeAspect="1"/>
+            </wp:cNvGraphicFramePr>
+            <a:graphic xmlns:a="http://schemas.openxmlformats.org/drawingml/2006/main">
+              <a:graphicData uri="http://schemas.openxmlformats.org/drawingml/2006/picture">
+                <pic:pic xmlns:pic="http://schemas.openxmlformats.org/drawingml/2006/picture">
+                  <pic:nvPicPr>
+                    <pic:cNvPr id="1" name="Imagen1"/>
+                    <pic:cNvPicPr>
+                      <a:picLocks noChangeAspect="1" noChangeArrowheads="1"/>
+                    </pic:cNvPicPr>
+                  </pic:nvPicPr>
+                  <pic:blipFill>
+                    <a:blip r:embed="rId2"/>
+                    <a:stretch>
+                      <a:fillRect/>
+                    </a:stretch>
+                  </pic:blipFill>
+                  <pic:spPr bwMode="auto">
+                    <a:xfrm>
+                      <a:off x="0" y="0"/>
+                      <a:ext cx="6120130" cy="2767965"/>
+                    </a:xfrm>
+                    <a:prstGeom prst="rect">
+                      <a:avLst/>
+                    </a:prstGeom>
+                    <a:noFill/>
+                  </pic:spPr>
+                </pic:pic>
+              </a:graphicData>
+            </a:graphic>
+          </wp:anchor>
+        </w:drawing>
+      </w:r>
+      <w:r>
+        <w:rPr>
+          <w:b/>
+          <w:bCs/>
+          <w:sz w:val="36"/>
+          <w:szCs w:val="36"/>
+        </w:rPr>
+        <w:fldChar w:fldCharType="end"/>
+      </w:r>
+    </w:p>
+    <w:p>
+      <w:pPr>
+        <w:pStyle w:val="Normal"/>
+        <w:bidi w:val="0"/>
+        <w:jc w:val="start"/>
+        <w:rPr>
+          <w:b/>
+          <w:bCs/>
+          <w:sz w:val="36"/>
+          <w:szCs w:val="36"/>
+        </w:rPr>
+      </w:pPr>
+      <w:r>
+        <w:rPr>
+          <w:b/>
+          <w:bCs/>
+          <w:sz w:val="36"/>
+          <w:szCs w:val="36"/>
+        </w:rPr>
+        <w:t>1- Campo para introducir el nick de usuario</w:t>
+      </w:r>
+    </w:p>
+    <w:p>
+      <w:pPr>
+        <w:pStyle w:val="Normal"/>
+        <w:bidi w:val="0"/>
+        <w:jc w:val="start"/>
+        <w:rPr>
+          <w:b/>
+          <w:bCs/>
+          <w:sz w:val="36"/>
+          <w:szCs w:val="36"/>
+        </w:rPr>
+      </w:pPr>
+      <w:r>
+        <w:rPr>
+          <w:b/>
+          <w:bCs/>
+          <w:sz w:val="36"/>
+          <w:szCs w:val="36"/>
+        </w:rPr>
+        <w:t>2- Campo para introducir la contraseña del usuarios</w:t>
+      </w:r>
+    </w:p>
+    <w:p>
+      <w:pPr>
+        <w:pStyle w:val="Normal"/>
+        <w:bidi w:val="0"/>
+        <w:jc w:val="start"/>
+        <w:rPr>
+          <w:b/>
+          <w:bCs/>
+          <w:sz w:val="36"/>
+          <w:szCs w:val="36"/>
+        </w:rPr>
+      </w:pPr>
+      <w:r>
+        <w:rPr>
+          <w:b/>
+          <w:bCs/>
+          <w:sz w:val="36"/>
+          <w:szCs w:val="36"/>
+        </w:rPr>
+        <w:t>3- Boton para realizar el login</w:t>
+      </w:r>
+    </w:p>
+    <w:p>
+      <w:pPr>
+        <w:pStyle w:val="Normal"/>
+        <w:bidi w:val="0"/>
+        <w:jc w:val="start"/>
+        <w:rPr>
+          <w:b/>
+          <w:bCs/>
+          <w:sz w:val="36"/>
+          <w:szCs w:val="36"/>
+        </w:rPr>
+      </w:pPr>
+      <w:r>
+        <w:rPr>
+          <w:b/>
+          <w:bCs/>
+          <w:sz w:val="36"/>
+          <w:szCs w:val="36"/>
+        </w:rPr>
+        <w:t>4- Enlace para registrarse si no tiene una cuenta</w:t>
+      </w:r>
+    </w:p>
+    <w:p>
+      <w:pPr>
+        <w:pStyle w:val="Normal"/>
+        <w:bidi w:val="0"/>
+        <w:jc w:val="start"/>
+        <w:rPr>
+          <w:b/>
+          <w:bCs/>
+          <w:sz w:val="36"/>
+          <w:szCs w:val="36"/>
+        </w:rPr>
+      </w:pPr>
+      <w:r>
+        <w:rPr>
+          <w:b/>
+          <w:bCs/>
+          <w:sz w:val="36"/>
+          <w:szCs w:val="36"/>
+        </w:rPr>
+      </w:r>
+    </w:p>
+    <w:p>
+      <w:pPr>
+        <w:pStyle w:val="Normal"/>
+        <w:bidi w:val="0"/>
+        <w:jc w:val="start"/>
+        <w:rPr>
+          <w:b/>
+          <w:bCs/>
+          <w:sz w:val="36"/>
+          <w:szCs w:val="36"/>
+        </w:rPr>
+      </w:pPr>
+      <w:r>
+        <w:rPr>
+          <w:b/>
+          <w:bCs/>
+          <w:sz w:val="36"/>
+          <w:szCs w:val="36"/>
+        </w:rPr>
+      </w:r>
+    </w:p>
+    <w:p>
+      <w:pPr>
+        <w:pStyle w:val="Normal"/>
+        <w:bidi w:val="0"/>
+        <w:jc w:val="start"/>
+        <w:rPr>
+          <w:b/>
+          <w:bCs/>
+          <w:sz w:val="36"/>
+          <w:szCs w:val="36"/>
+        </w:rPr>
+      </w:pPr>
+      <w:r>
+        <w:rPr>
+          <w:b/>
+          <w:bCs/>
+          <w:sz w:val="36"/>
+          <w:szCs w:val="36"/>
+        </w:rPr>
+      </w:r>
+    </w:p>
+    <w:p>
+      <w:pPr>
+        <w:pStyle w:val="Normal"/>
+        <w:bidi w:val="0"/>
+        <w:jc w:val="start"/>
+        <w:rPr>
+          <w:b/>
+          <w:bCs/>
+          <w:sz w:val="36"/>
+          <w:szCs w:val="36"/>
+        </w:rPr>
+      </w:pPr>
+      <w:r>
+        <w:rPr>
+          <w:b/>
+          <w:bCs/>
+          <w:sz w:val="36"/>
+          <w:szCs w:val="36"/>
+        </w:rPr>
+      </w:r>
+    </w:p>
+    <w:p>
+      <w:pPr>
+        <w:pStyle w:val="Normal"/>
+        <w:bidi w:val="0"/>
+        <w:jc w:val="start"/>
+        <w:rPr>
+          <w:b/>
+          <w:bCs/>
+          <w:sz w:val="36"/>
+          <w:szCs w:val="36"/>
+        </w:rPr>
+      </w:pPr>
+      <w:r>
+        <w:rPr>
+          <w:b/>
+          <w:bCs/>
+          <w:sz w:val="36"/>
+          <w:szCs w:val="36"/>
+        </w:rPr>
+      </w:r>
+    </w:p>
+    <w:p>
+      <w:pPr>
+        <w:pStyle w:val="Normal"/>
+        <w:bidi w:val="0"/>
+        <w:jc w:val="start"/>
+        <w:rPr>
+          <w:b/>
+          <w:bCs/>
+          <w:sz w:val="36"/>
+          <w:szCs w:val="36"/>
+        </w:rPr>
+      </w:pPr>
+      <w:r>
+        <w:rPr>
+          <w:b/>
+          <w:bCs/>
+          <w:sz w:val="36"/>
+          <w:szCs w:val="36"/>
+        </w:rPr>
+      </w:r>
+    </w:p>
+    <w:p>
+      <w:pPr>
+        <w:pStyle w:val="Normal"/>
+        <w:bidi w:val="0"/>
+        <w:jc w:val="start"/>
+        <w:rPr>
+          <w:b/>
+          <w:bCs/>
+          <w:sz w:val="36"/>
+          <w:szCs w:val="36"/>
+        </w:rPr>
+      </w:pPr>
+      <w:r>
+        <w:rPr>
+          <w:b/>
+          <w:bCs/>
+          <w:sz w:val="36"/>
+          <w:szCs w:val="36"/>
+        </w:rPr>
+      </w:r>
+    </w:p>
+    <w:p>
+      <w:pPr>
+        <w:pStyle w:val="Normal"/>
+        <w:bidi w:val="0"/>
+        <w:jc w:val="start"/>
+        <w:rPr>
+          <w:b/>
+          <w:bCs/>
+          <w:sz w:val="36"/>
+          <w:szCs w:val="36"/>
+        </w:rPr>
+      </w:pPr>
+      <w:r>
+        <w:rPr>
+          <w:b/>
+          <w:bCs/>
+          <w:sz w:val="36"/>
+          <w:szCs w:val="36"/>
+        </w:rPr>
+      </w:r>
+    </w:p>
+    <w:p>
+      <w:pPr>
+        <w:pStyle w:val="Normal"/>
+        <w:bidi w:val="0"/>
+        <w:jc w:val="start"/>
+        <w:rPr>
+          <w:b/>
+          <w:bCs/>
+          <w:sz w:val="36"/>
+          <w:szCs w:val="36"/>
+        </w:rPr>
+      </w:pPr>
+      <w:r>
+        <w:rPr>
+          <w:b/>
+          <w:bCs/>
+          <w:sz w:val="36"/>
+          <w:szCs w:val="36"/>
+        </w:rPr>
+      </w:r>
+    </w:p>
+    <w:p>
+      <w:pPr>
+        <w:pStyle w:val="Normal"/>
+        <w:bidi w:val="0"/>
+        <w:jc w:val="start"/>
+        <w:rPr>
+          <w:b/>
+          <w:bCs/>
+          <w:sz w:val="36"/>
+          <w:szCs w:val="36"/>
+        </w:rPr>
+      </w:pPr>
+      <w:r>
+        <w:rPr>
+          <w:b/>
+          <w:bCs/>
+          <w:sz w:val="36"/>
+          <w:szCs w:val="36"/>
+        </w:rPr>
+      </w:r>
+    </w:p>
+    <w:p>
+      <w:pPr>
+        <w:pStyle w:val="Normal"/>
+        <w:bidi w:val="0"/>
+        <w:jc w:val="start"/>
+        <w:rPr>
+          <w:b/>
+          <w:bCs/>
+          <w:sz w:val="36"/>
+          <w:szCs w:val="36"/>
+        </w:rPr>
+      </w:pPr>
+      <w:r>
+        <w:rPr>
+          <w:b/>
+          <w:bCs/>
+          <w:sz w:val="36"/>
+          <w:szCs w:val="36"/>
+        </w:rPr>
+      </w:r>
+    </w:p>
+    <w:p>
+      <w:pPr>
+        <w:pStyle w:val="Normal"/>
+        <w:bidi w:val="0"/>
+        <w:jc w:val="start"/>
+        <w:rPr>
+          <w:b/>
+          <w:bCs/>
+          <w:sz w:val="36"/>
+          <w:szCs w:val="36"/>
+        </w:rPr>
+      </w:pPr>
+      <w:r>
+        <w:rPr>
+          <w:b/>
+          <w:bCs/>
+          <w:sz w:val="36"/>
+          <w:szCs w:val="36"/>
+        </w:rPr>
+      </w:r>
+    </w:p>
+    <w:p>
+      <w:pPr>
+        <w:pStyle w:val="Normal"/>
+        <w:bidi w:val="0"/>
+        <w:jc w:val="start"/>
+        <w:rPr>
+          <w:b/>
+          <w:bCs/>
+          <w:sz w:val="36"/>
+          <w:szCs w:val="36"/>
+        </w:rPr>
+      </w:pPr>
+      <w:r>
+        <w:rPr>
+          <w:b/>
+          <w:bCs/>
+          <w:sz w:val="36"/>
+          <w:szCs w:val="36"/>
+        </w:rPr>
+      </w:r>
+    </w:p>
+    <w:p>
+      <w:pPr>
+        <w:pStyle w:val="Normal"/>
+        <w:bidi w:val="0"/>
+        <w:jc w:val="start"/>
+        <w:rPr>
+          <w:b/>
+          <w:bCs/>
+          <w:sz w:val="36"/>
+          <w:szCs w:val="36"/>
+        </w:rPr>
+      </w:pPr>
+      <w:r>
+        <w:rPr>
+          <w:b/>
+          <w:bCs/>
+          <w:sz w:val="36"/>
+          <w:szCs w:val="36"/>
+        </w:rPr>
+      </w:r>
+    </w:p>
+    <w:p>
+      <w:pPr>
+        <w:pStyle w:val="Normal"/>
+        <w:bidi w:val="0"/>
+        <w:jc w:val="start"/>
+        <w:rPr>
+          <w:b/>
+          <w:bCs/>
+          <w:sz w:val="36"/>
+          <w:szCs w:val="36"/>
+        </w:rPr>
+      </w:pPr>
+      <w:r>
+        <w:rPr>
+          <w:b/>
+          <w:bCs/>
+          <w:sz w:val="36"/>
+          <w:szCs w:val="36"/>
+        </w:rPr>
+      </w:r>
+    </w:p>
+    <w:p>
+      <w:pPr>
+        <w:pStyle w:val="Normal"/>
+        <w:bidi w:val="0"/>
+        <w:jc w:val="center"/>
+        <w:rPr>
+          <w:b/>
+          <w:bCs/>
+          <w:sz w:val="44"/>
+          <w:szCs w:val="44"/>
+        </w:rPr>
+      </w:pPr>
+      <w:r>
+        <w:fldChar w:fldCharType="begin"/>
+      </w:r>
+      <w:r>
+        <w:rPr>
+          <w:b/>
+          <w:bCs/>
+          <w:sz w:val="44"/>
+          <w:szCs w:val="44"/>
+        </w:rPr>
+        <w:instrText xml:space="preserve"> XE "Registrarse" \f "Índice personalizado" </w:instrText>
+      </w:r>
+      <w:r>
+        <w:rPr>
+          <w:b/>
+          <w:bCs/>
+          <w:sz w:val="44"/>
+          <w:szCs w:val="44"/>
+        </w:rPr>
+        <w:fldChar w:fldCharType="separate"/>
+      </w:r>
+      <w:r>
+        <w:rPr>
+          <w:b/>
+          <w:bCs/>
+          <w:sz w:val="44"/>
+          <w:szCs w:val="44"/>
+        </w:rPr>
+        <w:t>Registrarse</w:t>
+      </w:r>
+      <w:r>
+        <w:rPr>
+          <w:b/>
+          <w:bCs/>
+          <w:sz w:val="44"/>
+          <w:szCs w:val="44"/>
+        </w:rPr>
+        <w:fldChar w:fldCharType="end"/>
+      </w:r>
+    </w:p>
+    <w:p>
+      <w:pPr>
+        <w:pStyle w:val="Normal"/>
+        <w:bidi w:val="0"/>
+        <w:jc w:val="start"/>
+        <w:rPr>
+          <w:b/>
+          <w:bCs/>
+          <w:sz w:val="36"/>
+          <w:szCs w:val="36"/>
+        </w:rPr>
+      </w:pPr>
+      <w:r>
+        <w:rPr>
+          <w:b/>
+          <w:bCs/>
+          <w:sz w:val="36"/>
+          <w:szCs w:val="36"/>
+        </w:rPr>
+      </w:r>
+    </w:p>
+    <w:p>
+      <w:pPr>
+        <w:pStyle w:val="Normal"/>
+        <w:bidi w:val="0"/>
+        <w:jc w:val="start"/>
+        <w:rPr>
+          <w:b/>
+          <w:bCs/>
+          <w:sz w:val="52"/>
+          <w:szCs w:val="52"/>
+        </w:rPr>
+      </w:pPr>
+      <w:r>
+        <w:rPr>
+          <w:b/>
+          <w:bCs/>
+          <w:sz w:val="52"/>
+          <w:szCs w:val="52"/>
+        </w:rPr>
+        <w:drawing>
+          <wp:anchor distT="0" distB="0" distL="0" distR="0" simplePos="0" relativeHeight="3" behindDoc="0" locked="0" layoutInCell="0" allowOverlap="1">
+            <wp:simplePos x="0" y="0"/>
+            <wp:positionH relativeFrom="column">
+              <wp:align>center</wp:align>
+            </wp:positionH>
+            <wp:positionV relativeFrom="paragraph">
+              <wp:posOffset>635</wp:posOffset>
+            </wp:positionV>
+            <wp:extent cx="6120130" cy="2771140"/>
+            <wp:effectExtent l="0" t="0" r="0" b="0"/>
+            <wp:wrapSquare wrapText="largest"/>
+            <wp:docPr id="2" name="Imagen2"/>
+            <wp:cNvGraphicFramePr>
+              <a:graphicFrameLocks xmlns:a="http://schemas.openxmlformats.org/drawingml/2006/main" noChangeAspect="1"/>
+            </wp:cNvGraphicFramePr>
+            <a:graphic xmlns:a="http://schemas.openxmlformats.org/drawingml/2006/main">
+              <a:graphicData uri="http://schemas.openxmlformats.org/drawingml/2006/picture">
+                <pic:pic xmlns:pic="http://schemas.openxmlformats.org/drawingml/2006/picture">
+                  <pic:nvPicPr>
+                    <pic:cNvPr id="2" name="Imagen2"/>
+                    <pic:cNvPicPr>
+                      <a:picLocks noChangeAspect="1" noChangeArrowheads="1"/>
+                    </pic:cNvPicPr>
+                  </pic:nvPicPr>
+                  <pic:blipFill>
+                    <a:blip r:embed="rId3"/>
+                    <a:stretch>
+                      <a:fillRect/>
+                    </a:stretch>
+                  </pic:blipFill>
+                  <pic:spPr bwMode="auto">
+                    <a:xfrm>
+                      <a:off x="0" y="0"/>
+                      <a:ext cx="6120130" cy="2771140"/>
+                    </a:xfrm>
+                    <a:prstGeom prst="rect">
+                      <a:avLst/>
+                    </a:prstGeom>
+                    <a:noFill/>
+                  </pic:spPr>
+                </pic:pic>
+              </a:graphicData>
+            </a:graphic>
+          </wp:anchor>
+        </w:drawing>
+      </w:r>
+    </w:p>
+    <w:p>
+      <w:pPr>
+        <w:pStyle w:val="Normal"/>
+        <w:bidi w:val="0"/>
+        <w:jc w:val="start"/>
+        <w:rPr>
+          <w:b/>
+          <w:bCs/>
+          <w:sz w:val="36"/>
+          <w:szCs w:val="36"/>
+        </w:rPr>
+      </w:pPr>
+      <w:r>
+        <w:rPr>
+          <w:b/>
+          <w:bCs/>
+          <w:sz w:val="36"/>
+          <w:szCs w:val="36"/>
+        </w:rPr>
+        <w:t>1- Campo para introducir el nick de usuario</w:t>
+      </w:r>
+    </w:p>
+    <w:p>
+      <w:pPr>
+        <w:pStyle w:val="Normal"/>
+        <w:bidi w:val="0"/>
+        <w:jc w:val="start"/>
+        <w:rPr>
+          <w:b/>
+          <w:bCs/>
+          <w:sz w:val="36"/>
+          <w:szCs w:val="36"/>
+        </w:rPr>
+      </w:pPr>
+      <w:r>
+        <w:rPr>
+          <w:b/>
+          <w:bCs/>
+          <w:sz w:val="36"/>
+          <w:szCs w:val="36"/>
+        </w:rPr>
+        <w:t>2- Campo para introducir el email del usuarios</w:t>
+      </w:r>
+    </w:p>
+    <w:p>
+      <w:pPr>
+        <w:pStyle w:val="Normal"/>
+        <w:bidi w:val="0"/>
+        <w:jc w:val="start"/>
+        <w:rPr>
+          <w:b/>
+          <w:bCs/>
+          <w:sz w:val="36"/>
+          <w:szCs w:val="36"/>
+        </w:rPr>
+      </w:pPr>
+      <w:r>
+        <w:rPr>
+          <w:b/>
+          <w:bCs/>
+          <w:sz w:val="36"/>
+          <w:szCs w:val="36"/>
+        </w:rPr>
+        <w:t>3- Campo para introducir el nombre del usuarios</w:t>
+      </w:r>
+    </w:p>
+    <w:p>
+      <w:pPr>
+        <w:pStyle w:val="Normal"/>
+        <w:bidi w:val="0"/>
+        <w:jc w:val="start"/>
+        <w:rPr>
+          <w:b/>
+          <w:bCs/>
+          <w:sz w:val="36"/>
+          <w:szCs w:val="36"/>
+        </w:rPr>
+      </w:pPr>
+      <w:r>
+        <w:rPr>
+          <w:b/>
+          <w:bCs/>
+          <w:sz w:val="36"/>
+          <w:szCs w:val="36"/>
+        </w:rPr>
+        <w:t>4- Campo para introducir la contraseña del usuarios</w:t>
+      </w:r>
+    </w:p>
+    <w:p>
+      <w:pPr>
+        <w:pStyle w:val="Normal"/>
+        <w:bidi w:val="0"/>
+        <w:jc w:val="start"/>
+        <w:rPr>
+          <w:b/>
+          <w:bCs/>
+          <w:sz w:val="36"/>
+          <w:szCs w:val="36"/>
+        </w:rPr>
+      </w:pPr>
+      <w:r>
+        <w:rPr>
+          <w:b/>
+          <w:bCs/>
+          <w:sz w:val="36"/>
+          <w:szCs w:val="36"/>
+        </w:rPr>
+        <w:t>4- Campo para volver a introducir la contraseña del usuarios</w:t>
+      </w:r>
+    </w:p>
+    <w:p>
+      <w:pPr>
+        <w:pStyle w:val="Normal"/>
+        <w:bidi w:val="0"/>
+        <w:jc w:val="start"/>
+        <w:rPr>
+          <w:b/>
+          <w:bCs/>
+          <w:sz w:val="36"/>
+          <w:szCs w:val="36"/>
+        </w:rPr>
+      </w:pPr>
+      <w:r>
+        <w:rPr>
+          <w:b/>
+          <w:bCs/>
+          <w:sz w:val="36"/>
+          <w:szCs w:val="36"/>
+        </w:rPr>
+        <w:t>6- Boton para registrarse</w:t>
+      </w:r>
+    </w:p>
+    <w:p>
+      <w:pPr>
+        <w:pStyle w:val="Normal"/>
+        <w:bidi w:val="0"/>
+        <w:jc w:val="start"/>
+        <w:rPr>
+          <w:b/>
+          <w:bCs/>
+          <w:sz w:val="36"/>
+          <w:szCs w:val="36"/>
+        </w:rPr>
+      </w:pPr>
+      <w:r>
+        <w:rPr>
+          <w:b/>
+          <w:bCs/>
+          <w:sz w:val="36"/>
+          <w:szCs w:val="36"/>
+        </w:rPr>
+        <w:t>7- Enlace para iniciar sesion si tiene una cuenta</w:t>
+      </w:r>
+    </w:p>
+    <w:p>
+      <w:pPr>
+        <w:pStyle w:val="Normal"/>
+        <w:bidi w:val="0"/>
+        <w:jc w:val="start"/>
+        <w:rPr>
+          <w:b/>
+          <w:bCs/>
+          <w:sz w:val="52"/>
+          <w:szCs w:val="52"/>
+        </w:rPr>
+      </w:pPr>
+      <w:r>
+        <w:rPr>
+          <w:b/>
+          <w:bCs/>
+          <w:sz w:val="52"/>
+          <w:szCs w:val="52"/>
+        </w:rPr>
+      </w:r>
+    </w:p>
+    <w:p>
+      <w:pPr>
+        <w:pStyle w:val="Normal"/>
+        <w:bidi w:val="0"/>
+        <w:jc w:val="start"/>
+        <w:rPr>
+          <w:b/>
+          <w:bCs/>
+          <w:sz w:val="52"/>
+          <w:szCs w:val="52"/>
+        </w:rPr>
+      </w:pPr>
+      <w:r>
+        <w:rPr>
+          <w:b/>
+          <w:bCs/>
+          <w:sz w:val="52"/>
+          <w:szCs w:val="52"/>
+        </w:rPr>
+      </w:r>
+    </w:p>
+    <w:p>
+      <w:pPr>
+        <w:pStyle w:val="Normal"/>
+        <w:bidi w:val="0"/>
+        <w:jc w:val="start"/>
+        <w:rPr>
+          <w:b/>
+          <w:bCs/>
+          <w:sz w:val="52"/>
+          <w:szCs w:val="52"/>
+        </w:rPr>
+      </w:pPr>
+      <w:r>
+        <w:rPr>
+          <w:b/>
+          <w:bCs/>
+          <w:sz w:val="52"/>
+          <w:szCs w:val="52"/>
+        </w:rPr>
+      </w:r>
+    </w:p>
+    <w:p>
+      <w:pPr>
+        <w:pStyle w:val="Normal"/>
+        <w:bidi w:val="0"/>
+        <w:jc w:val="start"/>
+        <w:rPr>
+          <w:b/>
+          <w:bCs/>
+          <w:sz w:val="52"/>
+          <w:szCs w:val="52"/>
+        </w:rPr>
+      </w:pPr>
+      <w:r>
+        <w:rPr>
+          <w:b/>
+          <w:bCs/>
+          <w:sz w:val="52"/>
+          <w:szCs w:val="52"/>
+        </w:rPr>
+      </w:r>
+    </w:p>
+    <w:p>
+      <w:pPr>
+        <w:pStyle w:val="Normal"/>
+        <w:bidi w:val="0"/>
+        <w:jc w:val="start"/>
+        <w:rPr>
+          <w:b/>
+          <w:bCs/>
+          <w:sz w:val="52"/>
+          <w:szCs w:val="52"/>
+        </w:rPr>
+      </w:pPr>
+      <w:r>
+        <w:rPr>
+          <w:b/>
+          <w:bCs/>
+          <w:sz w:val="52"/>
+          <w:szCs w:val="52"/>
+        </w:rPr>
+      </w:r>
+    </w:p>
+    <w:p>
+      <w:pPr>
+        <w:pStyle w:val="Normal"/>
+        <w:bidi w:val="0"/>
+        <w:jc w:val="start"/>
+        <w:rPr>
+          <w:b/>
+          <w:bCs/>
+          <w:sz w:val="52"/>
+          <w:szCs w:val="52"/>
+        </w:rPr>
+      </w:pPr>
+      <w:r>
+        <w:rPr>
+          <w:b/>
+          <w:bCs/>
+          <w:sz w:val="52"/>
+          <w:szCs w:val="52"/>
+        </w:rPr>
+      </w:r>
+    </w:p>
+    <w:p>
+      <w:pPr>
+        <w:pStyle w:val="Normal"/>
+        <w:bidi w:val="0"/>
+        <w:jc w:val="start"/>
+        <w:rPr>
+          <w:b/>
+          <w:bCs/>
+          <w:sz w:val="52"/>
+          <w:szCs w:val="52"/>
+        </w:rPr>
+      </w:pPr>
+      <w:r>
+        <w:rPr>
+          <w:b/>
+          <w:bCs/>
+          <w:sz w:val="52"/>
+          <w:szCs w:val="52"/>
+        </w:rPr>
+      </w:r>
+    </w:p>
+    <w:p>
+      <w:pPr>
+        <w:pStyle w:val="Normal"/>
+        <w:bidi w:val="0"/>
+        <w:jc w:val="start"/>
+        <w:rPr>
+          <w:b/>
+          <w:bCs/>
+          <w:sz w:val="52"/>
+          <w:szCs w:val="52"/>
+        </w:rPr>
+      </w:pPr>
+      <w:r>
+        <w:rPr>
+          <w:b/>
+          <w:bCs/>
+          <w:sz w:val="52"/>
+          <w:szCs w:val="52"/>
+        </w:rPr>
+      </w:r>
+    </w:p>
+    <w:p>
+      <w:pPr>
+        <w:pStyle w:val="Normal"/>
+        <w:bidi w:val="0"/>
+        <w:jc w:val="start"/>
+        <w:rPr>
+          <w:b/>
+          <w:bCs/>
+          <w:sz w:val="52"/>
+          <w:szCs w:val="52"/>
+        </w:rPr>
+      </w:pPr>
+      <w:r>
+        <w:rPr>
+          <w:b/>
+          <w:bCs/>
+          <w:sz w:val="52"/>
+          <w:szCs w:val="52"/>
+        </w:rPr>
+      </w:r>
+    </w:p>
+    <w:p>
+      <w:pPr>
+        <w:pStyle w:val="Normal"/>
+        <w:bidi w:val="0"/>
+        <w:jc w:val="start"/>
+        <w:rPr>
+          <w:b/>
+          <w:bCs/>
+          <w:sz w:val="52"/>
+          <w:szCs w:val="52"/>
+        </w:rPr>
+      </w:pPr>
+      <w:r>
+        <w:rPr>
+          <w:b/>
+          <w:bCs/>
+          <w:sz w:val="52"/>
+          <w:szCs w:val="52"/>
+        </w:rPr>
+      </w:r>
+    </w:p>
+    <w:p>
+      <w:pPr>
+        <w:pStyle w:val="Normal"/>
+        <w:bidi w:val="0"/>
+        <w:jc w:val="start"/>
+        <w:rPr>
+          <w:b/>
+          <w:bCs/>
+          <w:sz w:val="52"/>
+          <w:szCs w:val="52"/>
+        </w:rPr>
+      </w:pPr>
+      <w:r>
+        <w:rPr>
+          <w:b/>
+          <w:bCs/>
+          <w:sz w:val="52"/>
+          <w:szCs w:val="52"/>
+        </w:rPr>
+      </w:r>
+    </w:p>
+    <w:p>
+      <w:pPr>
+        <w:pStyle w:val="Normal"/>
+        <w:bidi w:val="0"/>
+        <w:jc w:val="start"/>
+        <w:rPr>
+          <w:b/>
+          <w:bCs/>
+          <w:sz w:val="52"/>
+          <w:szCs w:val="52"/>
+        </w:rPr>
+      </w:pPr>
+      <w:r>
+        <w:rPr>
+          <w:b/>
+          <w:bCs/>
+          <w:sz w:val="52"/>
+          <w:szCs w:val="52"/>
+        </w:rPr>
+      </w:r>
+    </w:p>
+    <w:p>
+      <w:pPr>
+        <w:pStyle w:val="Normal"/>
+        <w:bidi w:val="0"/>
+        <w:jc w:val="start"/>
+        <w:rPr>
+          <w:b/>
+          <w:bCs/>
+          <w:sz w:val="52"/>
+          <w:szCs w:val="52"/>
+        </w:rPr>
+      </w:pPr>
+      <w:r>
+        <w:rPr>
+          <w:b/>
+          <w:bCs/>
+          <w:sz w:val="52"/>
+          <w:szCs w:val="52"/>
+        </w:rPr>
+      </w:r>
+    </w:p>
+    <w:p>
+      <w:pPr>
+        <w:pStyle w:val="Normal"/>
+        <w:bidi w:val="0"/>
+        <w:jc w:val="start"/>
+        <w:rPr>
+          <w:b/>
+          <w:bCs/>
+          <w:sz w:val="52"/>
+          <w:szCs w:val="52"/>
+        </w:rPr>
+      </w:pPr>
+      <w:r>
+        <w:rPr>
+          <w:b/>
+          <w:bCs/>
+          <w:sz w:val="52"/>
+          <w:szCs w:val="52"/>
+        </w:rPr>
+      </w:r>
+    </w:p>
+    <w:p>
+      <w:pPr>
+        <w:pStyle w:val="Normal"/>
+        <w:bidi w:val="0"/>
+        <w:jc w:val="start"/>
+        <w:rPr>
+          <w:b/>
+          <w:bCs/>
+          <w:sz w:val="52"/>
+          <w:szCs w:val="52"/>
+        </w:rPr>
+      </w:pPr>
+      <w:r>
+        <w:rPr>
+          <w:b/>
+          <w:bCs/>
+          <w:sz w:val="52"/>
+          <w:szCs w:val="52"/>
+        </w:rPr>
+      </w:r>
+    </w:p>
+    <w:p>
+      <w:pPr>
+        <w:pStyle w:val="Normal"/>
+        <w:bidi w:val="0"/>
+        <w:jc w:val="start"/>
+        <w:rPr>
+          <w:b/>
+          <w:bCs/>
+          <w:sz w:val="52"/>
+          <w:szCs w:val="52"/>
+        </w:rPr>
+      </w:pPr>
+      <w:r>
+        <w:rPr>
+          <w:b/>
+          <w:bCs/>
+          <w:sz w:val="52"/>
+          <w:szCs w:val="52"/>
+        </w:rPr>
+      </w:r>
+    </w:p>
+    <w:p>
+      <w:pPr>
+        <w:pStyle w:val="Normal"/>
+        <w:bidi w:val="0"/>
+        <w:jc w:val="center"/>
+        <w:rPr>
+          <w:b/>
+          <w:bCs/>
+          <w:sz w:val="52"/>
+          <w:szCs w:val="52"/>
+        </w:rPr>
+      </w:pPr>
+      <w:r>
+        <w:rPr>
+          <w:b/>
+          <w:bCs/>
+          <w:sz w:val="52"/>
+          <w:szCs w:val="52"/>
+        </w:rPr>
+      </w:r>
+    </w:p>
+    <w:p>
+      <w:pPr>
+        <w:pStyle w:val="Normal"/>
+        <w:bidi w:val="0"/>
+        <w:jc w:val="center"/>
+        <w:rPr>
+          <w:b/>
+          <w:bCs/>
+          <w:sz w:val="52"/>
+          <w:szCs w:val="52"/>
+        </w:rPr>
+      </w:pPr>
+      <w:r>
+        <w:fldChar w:fldCharType="begin"/>
+      </w:r>
+      <w:r>
+        <w:rPr>
+          <w:b/>
+          <w:bCs/>
           <w:sz w:val="52"/>
           <w:szCs w:val="52"/>
         </w:rPr>
@@ -1892,8 +2649,8 @@
         <w:rPr>
           <w:b/>
           <w:bCs/>
-          <w:sz w:val="52"/>
-          <w:szCs w:val="52"/>
+          <w:sz w:val="64"/>
+          <w:szCs w:val="64"/>
         </w:rPr>
         <w:t>Bibliografia</w:t>
       </w:r>
@@ -1921,9 +2678,9 @@
       </w:r>
     </w:p>
     <w:sectPr>
-      <w:footerReference w:type="even" r:id="rId2"/>
-      <w:footerReference w:type="default" r:id="rId3"/>
-      <w:footerReference w:type="first" r:id="rId4"/>
+      <w:footerReference w:type="even" r:id="rId4"/>
+      <w:footerReference w:type="default" r:id="rId5"/>
+      <w:footerReference w:type="first" r:id="rId6"/>
       <w:type w:val="nextPage"/>
       <w:pgSz w:w="11906" w:h="16838"/>
       <w:pgMar w:left="1134" w:right="1134" w:gutter="0" w:header="0" w:top="1134" w:footer="1134" w:bottom="1693"/>
@@ -2287,7 +3044,7 @@
   </w:style>
   <w:style w:type="paragraph" w:styleId="Heading1">
     <w:name w:val="heading 1"/>
-    <w:basedOn w:val="Ttulouser"/>
+    <w:basedOn w:val="Ttulo"/>
     <w:next w:val="BodyText"/>
     <w:qFormat/>
     <w:pPr>
@@ -2389,8 +3146,8 @@
       <w:rFonts w:cs="Arial"/>
     </w:rPr>
   </w:style>
-  <w:style w:type="paragraph" w:styleId="Cabeceraypieuser">
-    <w:name w:val="Cabecera y pie (user)"/>
+  <w:style w:type="paragraph" w:styleId="Cabeceraypie">
+    <w:name w:val="Cabecera y pie"/>
     <w:basedOn w:val="Normal"/>
     <w:qFormat/>
     <w:pPr>
@@ -2403,8 +3160,8 @@
     </w:pPr>
     <w:rPr/>
   </w:style>
-  <w:style w:type="paragraph" w:styleId="Cabeceraypie">
-    <w:name w:val="Cabecera y pie"/>
+  <w:style w:type="paragraph" w:styleId="Cabeceraypieuser">
+    <w:name w:val="Cabecera y pie (user)"/>
     <w:basedOn w:val="Normal"/>
     <w:qFormat/>
     <w:pPr/>
@@ -2412,7 +3169,7 @@
   </w:style>
   <w:style w:type="paragraph" w:styleId="Footer">
     <w:name w:val="footer"/>
-    <w:basedOn w:val="Cabeceraypieuser"/>
+    <w:basedOn w:val="Cabeceraypie"/>
     <w:pPr>
       <w:suppressLineNumbers/>
     </w:pPr>
@@ -2420,7 +3177,7 @@
   </w:style>
   <w:style w:type="paragraph" w:styleId="IndexHeading">
     <w:name w:val="index heading"/>
-    <w:basedOn w:val="Ttulouser"/>
+    <w:basedOn w:val="Ttulo"/>
     <w:pPr>
       <w:suppressLineNumbers/>
       <w:ind w:hanging="0" w:start="0"/>
@@ -2432,8 +3189,8 @@
       <w:szCs w:val="32"/>
     </w:rPr>
   </w:style>
-  <w:style w:type="paragraph" w:styleId="Ttulodelndicedeusuariouser">
-    <w:name w:val="Título del índice de usuario (user)"/>
+  <w:style w:type="paragraph" w:styleId="Ttulodelndicedeusuario">
+    <w:name w:val="Título del índice de usuario"/>
     <w:basedOn w:val="IndexHeading"/>
     <w:qFormat/>
     <w:pPr>
@@ -2447,9 +3204,9 @@
       <w:szCs w:val="32"/>
     </w:rPr>
   </w:style>
-  <w:style w:type="paragraph" w:styleId="ndicedeusuario1user">
-    <w:name w:val="Índice de usuario 1 (user)"/>
-    <w:basedOn w:val="ndiceuser"/>
+  <w:style w:type="paragraph" w:styleId="ndicedeusuario1">
+    <w:name w:val="Índice de usuario 1"/>
+    <w:basedOn w:val="ndice"/>
     <w:qFormat/>
     <w:pPr>
       <w:tabs>
@@ -2457,6 +3214,19 @@
         <w:tab w:val="right" w:pos="9638" w:leader="dot"/>
       </w:tabs>
       <w:ind w:hanging="0" w:start="0"/>
+    </w:pPr>
+    <w:rPr/>
+  </w:style>
+  <w:style w:type="paragraph" w:styleId="ndicedeusuario2">
+    <w:name w:val="Índice de usuario 2"/>
+    <w:basedOn w:val="ndice"/>
+    <w:qFormat/>
+    <w:pPr>
+      <w:tabs>
+        <w:tab w:val="clear" w:pos="709"/>
+        <w:tab w:val="right" w:pos="9355" w:leader="dot"/>
+      </w:tabs>
+      <w:ind w:hanging="0" w:start="283"/>
     </w:pPr>
     <w:rPr/>
   </w:style>

</xml_diff>

<commit_message>
Falta manual de operaciones
</commit_message>
<xml_diff>
--- a/DOCUMENTACION/Manual_de_usuario.docx
+++ b/DOCUMENTACION/Manual_de_usuario.docx
@@ -44,12 +44,7 @@
         </w:rPr>
       </w:pPr>
       <w:r>
-        <w:rPr>
-          <w:b/>
-          <w:bCs/>
-          <w:sz w:val="72"/>
-          <w:szCs w:val="72"/>
-        </w:rPr>
+        <w:rPr/>
         <w:drawing>
           <wp:inline distT="0" distB="0" distL="0" distR="0">
             <wp:extent cx="6120130" cy="6120130"/>
@@ -101,6 +96,7 @@
         <w:p>
           <w:pPr>
             <w:pStyle w:val="TOCHeading"/>
+            <w:spacing w:before="0" w:after="120"/>
             <w:rPr/>
           </w:pPr>
           <w:r>
@@ -125,26 +121,27 @@
           </w:r>
           <w:r>
             <w:rPr>
-              <w:rStyle w:val="Enlacedelndice"/>
+              <w:rStyle w:val="Enlacedelndiceuser"/>
             </w:rPr>
             <w:instrText xml:space="preserve"> TOC \f \o "1-9" \h</w:instrText>
           </w:r>
           <w:r>
             <w:rPr>
-              <w:rStyle w:val="Enlacedelndice"/>
+              <w:rStyle w:val="Enlacedelndiceuser"/>
             </w:rPr>
             <w:fldChar w:fldCharType="separate"/>
           </w:r>
-          <w:hyperlink w:anchor="__RefHeading___Toc2797_4118683205" w:tooltip="Introducción">
-            <w:r>
-              <w:rPr>
-                <w:rStyle w:val="Enlacedelndice"/>
-              </w:rPr>
-              <w:t>Introducción</w:t>
-              <w:tab/>
-              <w:t>3</w:t>
-            </w:r>
-          </w:hyperlink>
+          <w:r>
+            <w:rPr>
+              <w:rStyle w:val="Enlacedelndiceuser"/>
+            </w:rPr>
+            <w:t>Introducción</w:t>
+          </w:r>
+          <w:r>
+            <w:rPr/>
+            <w:tab/>
+            <w:t>3</w:t>
+          </w:r>
         </w:p>
         <w:p>
           <w:pPr>
@@ -155,16 +152,12 @@
             </w:tabs>
             <w:rPr/>
           </w:pPr>
-          <w:hyperlink w:anchor="__RefHeading___Toc2799_4118683205" w:tooltip="Requisitos">
-            <w:r>
-              <w:rPr>
-                <w:rStyle w:val="Enlacedelndice"/>
-              </w:rPr>
-              <w:t>Requisitos</w:t>
-              <w:tab/>
-              <w:t>3</w:t>
-            </w:r>
-          </w:hyperlink>
+          <w:r>
+            <w:rPr/>
+            <w:t>Requisitos</w:t>
+            <w:tab/>
+            <w:t>3</w:t>
+          </w:r>
         </w:p>
         <w:p>
           <w:pPr>
@@ -175,16 +168,12 @@
             </w:tabs>
             <w:rPr/>
           </w:pPr>
-          <w:hyperlink w:anchor="__RefHeading___Toc2801_4118683205" w:tooltip="Acceder a la aplicación">
-            <w:r>
-              <w:rPr>
-                <w:rStyle w:val="Enlacedelndice"/>
-              </w:rPr>
-              <w:t>Acceder a la aplicación</w:t>
-              <w:tab/>
-              <w:t>4</w:t>
-            </w:r>
-          </w:hyperlink>
+          <w:r>
+            <w:rPr/>
+            <w:t>Acceder a la aplicación</w:t>
+            <w:tab/>
+            <w:t>4</w:t>
+          </w:r>
         </w:p>
         <w:p>
           <w:pPr>
@@ -195,16 +184,12 @@
             </w:tabs>
             <w:rPr/>
           </w:pPr>
-          <w:hyperlink w:anchor="__RefHeading___Toc2803_4118683205" w:tooltip="Desarrollo">
-            <w:r>
-              <w:rPr>
-                <w:rStyle w:val="Enlacedelndice"/>
-              </w:rPr>
-              <w:t>Desarrollo</w:t>
-              <w:tab/>
-              <w:t>5</w:t>
-            </w:r>
-          </w:hyperlink>
+          <w:r>
+            <w:rPr/>
+            <w:t>Desarrollo</w:t>
+            <w:tab/>
+            <w:t>5</w:t>
+          </w:r>
         </w:p>
         <w:p>
           <w:pPr>
@@ -215,16 +200,12 @@
             </w:tabs>
             <w:rPr/>
           </w:pPr>
-          <w:hyperlink w:anchor="__RefHeading___Toc2805_4118683205" w:tooltip="Pantalla principal">
-            <w:r>
-              <w:rPr>
-                <w:rStyle w:val="Enlacedelndice"/>
-              </w:rPr>
-              <w:t>Pantalla principal</w:t>
-              <w:tab/>
-              <w:t>5</w:t>
-            </w:r>
-          </w:hyperlink>
+          <w:r>
+            <w:rPr/>
+            <w:t>Pantalla principal</w:t>
+            <w:tab/>
+            <w:t>5</w:t>
+          </w:r>
         </w:p>
         <w:p>
           <w:pPr>
@@ -235,16 +216,12 @@
             </w:tabs>
             <w:rPr/>
           </w:pPr>
-          <w:hyperlink w:anchor="__RefHeading___Toc2807_4118683205" w:tooltip="Login">
-            <w:r>
-              <w:rPr>
-                <w:rStyle w:val="Enlacedelndice"/>
-              </w:rPr>
-              <w:t>Login</w:t>
-              <w:tab/>
-              <w:t>6</w:t>
-            </w:r>
-          </w:hyperlink>
+          <w:r>
+            <w:rPr/>
+            <w:t>Login</w:t>
+            <w:tab/>
+            <w:t>6</w:t>
+          </w:r>
         </w:p>
         <w:p>
           <w:pPr>
@@ -255,16 +232,12 @@
             </w:tabs>
             <w:rPr/>
           </w:pPr>
-          <w:hyperlink w:anchor="__RefHeading___Toc2809_4118683205" w:tooltip="Registrarse">
-            <w:r>
-              <w:rPr>
-                <w:rStyle w:val="Enlacedelndice"/>
-              </w:rPr>
-              <w:t>Registrarse</w:t>
-              <w:tab/>
-              <w:t>7</w:t>
-            </w:r>
-          </w:hyperlink>
+          <w:r>
+            <w:rPr/>
+            <w:t>Registrarse</w:t>
+            <w:tab/>
+            <w:t>7</w:t>
+          </w:r>
         </w:p>
         <w:p>
           <w:pPr>
@@ -275,16 +248,12 @@
             </w:tabs>
             <w:rPr/>
           </w:pPr>
-          <w:hyperlink w:anchor="__RefHeading___Toc3605_4118683205" w:tooltip="Creación de personaje">
-            <w:r>
-              <w:rPr>
-                <w:rStyle w:val="Enlacedelndice"/>
-              </w:rPr>
-              <w:t>Creación de personaje</w:t>
-              <w:tab/>
-              <w:t>9</w:t>
-            </w:r>
-          </w:hyperlink>
+          <w:r>
+            <w:rPr/>
+            <w:t>Creación de personaje</w:t>
+            <w:tab/>
+            <w:t>9</w:t>
+          </w:r>
         </w:p>
         <w:p>
           <w:pPr>
@@ -295,16 +264,12 @@
             </w:tabs>
             <w:rPr/>
           </w:pPr>
-          <w:hyperlink w:anchor="__RefHeading___Toc2811_4118683205" w:tooltip="Formulario parte 1">
-            <w:r>
-              <w:rPr>
-                <w:rStyle w:val="Enlacedelndice"/>
-              </w:rPr>
-              <w:t>Formulario parte 1</w:t>
-              <w:tab/>
-              <w:t>9</w:t>
-            </w:r>
-          </w:hyperlink>
+          <w:r>
+            <w:rPr/>
+            <w:t>Formulario parte 1</w:t>
+            <w:tab/>
+            <w:t>9</w:t>
+          </w:r>
         </w:p>
         <w:p>
           <w:pPr>
@@ -315,16 +280,12 @@
             </w:tabs>
             <w:rPr/>
           </w:pPr>
-          <w:hyperlink w:anchor="__RefHeading___Toc2813_4118683205" w:tooltip="Formulario parte 2">
-            <w:r>
-              <w:rPr>
-                <w:rStyle w:val="Enlacedelndice"/>
-              </w:rPr>
-              <w:t>Formulario parte 2</w:t>
-              <w:tab/>
-              <w:t>10</w:t>
-            </w:r>
-          </w:hyperlink>
+          <w:r>
+            <w:rPr/>
+            <w:t>Formulario parte 2</w:t>
+            <w:tab/>
+            <w:t>10</w:t>
+          </w:r>
         </w:p>
         <w:p>
           <w:pPr>
@@ -335,16 +296,12 @@
             </w:tabs>
             <w:rPr/>
           </w:pPr>
-          <w:hyperlink w:anchor="__RefHeading___Toc2815_4118683205" w:tooltip="Formulario parte 3">
-            <w:r>
-              <w:rPr>
-                <w:rStyle w:val="Enlacedelndice"/>
-              </w:rPr>
-              <w:t>Formulario parte 3</w:t>
-              <w:tab/>
-              <w:t>11</w:t>
-            </w:r>
-          </w:hyperlink>
+          <w:r>
+            <w:rPr/>
+            <w:t>Formulario parte 3</w:t>
+            <w:tab/>
+            <w:t>11</w:t>
+          </w:r>
         </w:p>
         <w:p>
           <w:pPr>
@@ -355,16 +312,12 @@
             </w:tabs>
             <w:rPr/>
           </w:pPr>
-          <w:hyperlink w:anchor="__RefHeading___Toc2817_4118683205" w:tooltip="Formulario parte 4">
-            <w:r>
-              <w:rPr>
-                <w:rStyle w:val="Enlacedelndice"/>
-              </w:rPr>
-              <w:t>Formulario parte 4</w:t>
-              <w:tab/>
-              <w:t>13</w:t>
-            </w:r>
-          </w:hyperlink>
+          <w:r>
+            <w:rPr/>
+            <w:t>Formulario parte 4</w:t>
+            <w:tab/>
+            <w:t>13</w:t>
+          </w:r>
         </w:p>
         <w:p>
           <w:pPr>
@@ -375,16 +328,12 @@
             </w:tabs>
             <w:rPr/>
           </w:pPr>
-          <w:hyperlink w:anchor="__RefHeading___Toc2819_4118683205" w:tooltip="Ver personaje">
-            <w:r>
-              <w:rPr>
-                <w:rStyle w:val="Enlacedelndice"/>
-              </w:rPr>
-              <w:t>Ver personaje</w:t>
-              <w:tab/>
-              <w:t>14</w:t>
-            </w:r>
-          </w:hyperlink>
+          <w:r>
+            <w:rPr/>
+            <w:t>Ver personaje</w:t>
+            <w:tab/>
+            <w:t>14</w:t>
+          </w:r>
         </w:p>
         <w:p>
           <w:pPr>
@@ -395,16 +344,12 @@
             </w:tabs>
             <w:rPr/>
           </w:pPr>
-          <w:hyperlink w:anchor="__RefHeading___Toc2821_4118683205" w:tooltip="Grupos">
-            <w:r>
-              <w:rPr>
-                <w:rStyle w:val="Enlacedelndice"/>
-              </w:rPr>
-              <w:t>Grupos</w:t>
-              <w:tab/>
-              <w:t>15</w:t>
-            </w:r>
-          </w:hyperlink>
+          <w:r>
+            <w:rPr/>
+            <w:t>Grupos</w:t>
+            <w:tab/>
+            <w:t>15</w:t>
+          </w:r>
         </w:p>
         <w:p>
           <w:pPr>
@@ -415,16 +360,12 @@
             </w:tabs>
             <w:rPr/>
           </w:pPr>
-          <w:hyperlink w:anchor="__RefHeading___Toc2823_4118683205" w:tooltip="Ver lista de grupos">
-            <w:r>
-              <w:rPr>
-                <w:rStyle w:val="Enlacedelndice"/>
-              </w:rPr>
-              <w:t>Ver lista de grupos</w:t>
-              <w:tab/>
-              <w:t>15</w:t>
-            </w:r>
-          </w:hyperlink>
+          <w:r>
+            <w:rPr/>
+            <w:t>Ver lista de grupos</w:t>
+            <w:tab/>
+            <w:t>15</w:t>
+          </w:r>
         </w:p>
         <w:p>
           <w:pPr>
@@ -435,16 +376,12 @@
             </w:tabs>
             <w:rPr/>
           </w:pPr>
-          <w:hyperlink w:anchor="__RefHeading___Toc2825_4118683205" w:tooltip="Añadir usuario al grupo">
-            <w:r>
-              <w:rPr>
-                <w:rStyle w:val="Enlacedelndice"/>
-              </w:rPr>
-              <w:t>Añadir usuario al grupo</w:t>
-              <w:tab/>
-              <w:t>16</w:t>
-            </w:r>
-          </w:hyperlink>
+          <w:r>
+            <w:rPr/>
+            <w:t>Añadir usuario al grupo</w:t>
+            <w:tab/>
+            <w:t>16</w:t>
+          </w:r>
         </w:p>
         <w:p>
           <w:pPr>
@@ -455,16 +392,12 @@
             </w:tabs>
             <w:rPr/>
           </w:pPr>
-          <w:hyperlink w:anchor="__RefHeading___Toc2827_4118683205" w:tooltip="Crear nuevo grupo">
-            <w:r>
-              <w:rPr>
-                <w:rStyle w:val="Enlacedelndice"/>
-              </w:rPr>
-              <w:t>Crear nuevo grupo</w:t>
-              <w:tab/>
-              <w:t>17</w:t>
-            </w:r>
-          </w:hyperlink>
+          <w:r>
+            <w:rPr/>
+            <w:t>Crear nuevo grupo</w:t>
+            <w:tab/>
+            <w:t>17</w:t>
+          </w:r>
         </w:p>
         <w:p>
           <w:pPr>
@@ -475,20 +408,14 @@
             </w:tabs>
             <w:rPr/>
           </w:pPr>
-          <w:hyperlink w:anchor="__RefHeading___Toc2829_4118683205" w:tooltip="Bibliografía">
-            <w:r>
-              <w:rPr>
-                <w:rStyle w:val="Enlacedelndice"/>
-              </w:rPr>
-              <w:t>Bibliografía</w:t>
-              <w:tab/>
-              <w:t>18</w:t>
-            </w:r>
-          </w:hyperlink>
           <w:r>
-            <w:rPr>
-              <w:rStyle w:val="Enlacedelndice"/>
-            </w:rPr>
+            <w:rPr/>
+            <w:t>Bibliografía</w:t>
+            <w:tab/>
+            <w:t>18</w:t>
+          </w:r>
+          <w:r>
+            <w:rPr/>
             <w:fldChar w:fldCharType="end"/>
           </w:r>
         </w:p>
@@ -496,7 +423,7 @@
     </w:sdt>
     <w:p>
       <w:pPr>
-        <w:pStyle w:val="Ttulodelndicedeusuariouser"/>
+        <w:pStyle w:val="Ttulodelndicedeusuario"/>
         <w:jc w:val="start"/>
         <w:rPr>
           <w:b/>
@@ -526,6 +453,7 @@
           <w:ilvl w:val="0"/>
           <w:numId w:val="2"/>
         </w:numPr>
+        <w:spacing w:before="0" w:after="120"/>
         <w:ind w:hanging="0" w:start="0"/>
         <w:rPr/>
       </w:pPr>
@@ -551,22 +479,41 @@
       <w:pPr>
         <w:pStyle w:val="Normal"/>
         <w:jc w:val="start"/>
-        <w:rPr>
-          <w:b/>
-          <w:bCs/>
-          <w:sz w:val="64"/>
-          <w:szCs w:val="64"/>
-          <w:shd w:fill="auto" w:val="clear"/>
-        </w:rPr>
-      </w:pPr>
-      <w:r>
-        <w:rPr>
-          <w:b/>
-          <w:bCs/>
-          <w:sz w:val="64"/>
-          <w:szCs w:val="64"/>
-          <w:shd w:fill="auto" w:val="clear"/>
-        </w:rPr>
+        <w:rPr/>
+      </w:pPr>
+      <w:r>
+        <w:rPr/>
+        <w:t>En este manual se especifica el funcionamiento de toda la web y se tratan los caso de uso sobre los que puede tener dudas un usuario.</w:t>
+      </w:r>
+    </w:p>
+    <w:p>
+      <w:pPr>
+        <w:pStyle w:val="Normal"/>
+        <w:jc w:val="start"/>
+        <w:rPr/>
+      </w:pPr>
+      <w:r>
+        <w:rPr/>
+      </w:r>
+    </w:p>
+    <w:p>
+      <w:pPr>
+        <w:pStyle w:val="Normal"/>
+        <w:jc w:val="start"/>
+        <w:rPr/>
+      </w:pPr>
+      <w:r>
+        <w:rPr/>
+      </w:r>
+    </w:p>
+    <w:p>
+      <w:pPr>
+        <w:pStyle w:val="Normal"/>
+        <w:jc w:val="start"/>
+        <w:rPr/>
+      </w:pPr>
+      <w:r>
+        <w:rPr/>
       </w:r>
     </w:p>
     <w:p>
@@ -574,7 +521,7 @@
         <w:pStyle w:val="Heading1"/>
         <w:numPr>
           <w:ilvl w:val="0"/>
-          <w:numId w:val="2"/>
+          <w:numId w:val="0"/>
         </w:numPr>
         <w:ind w:hanging="0" w:start="0"/>
         <w:rPr/>
@@ -600,14 +547,14 @@
         </w:tblCellMar>
       </w:tblPr>
       <w:tblGrid>
-        <w:gridCol w:w="3227"/>
-        <w:gridCol w:w="6411"/>
+        <w:gridCol w:w="3226"/>
+        <w:gridCol w:w="6412"/>
       </w:tblGrid>
       <w:tr>
         <w:trPr/>
         <w:tc>
           <w:tcPr>
-            <w:tcW w:w="3227" w:type="dxa"/>
+            <w:tcW w:w="3226" w:type="dxa"/>
             <w:tcBorders>
               <w:bottom w:val="single" w:sz="6" w:space="0" w:color="00599D"/>
             </w:tcBorders>
@@ -643,7 +590,7 @@
         </w:tc>
         <w:tc>
           <w:tcPr>
-            <w:tcW w:w="6411" w:type="dxa"/>
+            <w:tcW w:w="6412" w:type="dxa"/>
             <w:tcBorders>
               <w:bottom w:val="single" w:sz="6" w:space="0" w:color="00599D"/>
             </w:tcBorders>
@@ -682,7 +629,7 @@
         <w:trPr/>
         <w:tc>
           <w:tcPr>
-            <w:tcW w:w="3227" w:type="dxa"/>
+            <w:tcW w:w="3226" w:type="dxa"/>
             <w:tcBorders>
               <w:start w:val="single" w:sz="6" w:space="0" w:color="00599D"/>
             </w:tcBorders>
@@ -715,7 +662,7 @@
         </w:tc>
         <w:tc>
           <w:tcPr>
-            <w:tcW w:w="6411" w:type="dxa"/>
+            <w:tcW w:w="6412" w:type="dxa"/>
             <w:tcBorders>
               <w:end w:val="single" w:sz="6" w:space="0" w:color="00599D"/>
             </w:tcBorders>
@@ -751,7 +698,7 @@
         <w:trPr/>
         <w:tc>
           <w:tcPr>
-            <w:tcW w:w="3227" w:type="dxa"/>
+            <w:tcW w:w="3226" w:type="dxa"/>
             <w:tcBorders>
               <w:start w:val="single" w:sz="6" w:space="0" w:color="00599D"/>
             </w:tcBorders>
@@ -785,7 +732,7 @@
         </w:tc>
         <w:tc>
           <w:tcPr>
-            <w:tcW w:w="6411" w:type="dxa"/>
+            <w:tcW w:w="6412" w:type="dxa"/>
             <w:tcBorders>
               <w:end w:val="single" w:sz="6" w:space="0" w:color="00599D"/>
             </w:tcBorders>
@@ -822,7 +769,7 @@
         <w:trPr/>
         <w:tc>
           <w:tcPr>
-            <w:tcW w:w="3227" w:type="dxa"/>
+            <w:tcW w:w="3226" w:type="dxa"/>
             <w:tcBorders>
               <w:top w:val="single" w:sz="6" w:space="0" w:color="00599D"/>
               <w:start w:val="single" w:sz="6" w:space="0" w:color="00599D"/>
@@ -858,7 +805,7 @@
         </w:tc>
         <w:tc>
           <w:tcPr>
-            <w:tcW w:w="6411" w:type="dxa"/>
+            <w:tcW w:w="6412" w:type="dxa"/>
             <w:tcBorders>
               <w:top w:val="single" w:sz="6" w:space="0" w:color="00599D"/>
               <w:bottom w:val="single" w:sz="6" w:space="0" w:color="00599D"/>
@@ -953,6 +900,7 @@
           <w:ilvl w:val="0"/>
           <w:numId w:val="2"/>
         </w:numPr>
+        <w:spacing w:before="0" w:after="120"/>
         <w:ind w:hanging="0" w:start="0"/>
         <w:rPr/>
       </w:pPr>
@@ -1004,12 +952,7 @@
         </w:rPr>
       </w:pPr>
       <w:r>
-        <w:rPr>
-          <w:b/>
-          <w:bCs/>
-          <w:sz w:val="52"/>
-          <w:szCs w:val="52"/>
-        </w:rPr>
+        <w:rPr/>
         <w:drawing>
           <wp:inline distT="0" distB="0" distL="0" distR="0">
             <wp:extent cx="6120130" cy="3091815"/>
@@ -1238,6 +1181,10 @@
     <w:p>
       <w:pPr>
         <w:pStyle w:val="Heading2"/>
+        <w:numPr>
+          <w:ilvl w:val="1"/>
+          <w:numId w:val="1"/>
+        </w:numPr>
         <w:ind w:hanging="0" w:start="0"/>
         <w:rPr/>
       </w:pPr>
@@ -1862,6 +1809,7 @@
           <w:numId w:val="0"/>
         </w:numPr>
         <w:suppressAutoHyphens w:val="true"/>
+        <w:ind w:hanging="0" w:start="0"/>
         <w:jc w:val="start"/>
         <w:rPr>
           <w:b/>
@@ -1889,6 +1837,7 @@
           <w:ilvl w:val="0"/>
           <w:numId w:val="0"/>
         </w:numPr>
+        <w:spacing w:before="0" w:after="120"/>
         <w:ind w:hanging="0" w:start="0"/>
         <w:rPr/>
       </w:pPr>
@@ -2452,6 +2401,11 @@
     <w:p>
       <w:pPr>
         <w:pStyle w:val="Heading2"/>
+        <w:numPr>
+          <w:ilvl w:val="1"/>
+          <w:numId w:val="1"/>
+        </w:numPr>
+        <w:spacing w:before="0" w:after="120"/>
         <w:ind w:hanging="0" w:start="0"/>
         <w:rPr/>
       </w:pPr>
@@ -2465,6 +2419,10 @@
     <w:p>
       <w:pPr>
         <w:pStyle w:val="Heading3"/>
+        <w:numPr>
+          <w:ilvl w:val="2"/>
+          <w:numId w:val="1"/>
+        </w:numPr>
         <w:ind w:hanging="0" w:start="0"/>
         <w:rPr/>
       </w:pPr>
@@ -2683,6 +2641,7 @@
     <w:p>
       <w:pPr>
         <w:pStyle w:val="Normal"/>
+        <w:spacing w:before="0" w:after="0"/>
         <w:rPr/>
       </w:pPr>
       <w:r>
@@ -2892,6 +2851,10 @@
     <w:p>
       <w:pPr>
         <w:pStyle w:val="Heading3"/>
+        <w:numPr>
+          <w:ilvl w:val="2"/>
+          <w:numId w:val="1"/>
+        </w:numPr>
         <w:ind w:hanging="0" w:start="0"/>
         <w:rPr/>
       </w:pPr>
@@ -3034,6 +2997,11 @@
     <w:p>
       <w:pPr>
         <w:pStyle w:val="Heading3"/>
+        <w:numPr>
+          <w:ilvl w:val="2"/>
+          <w:numId w:val="1"/>
+        </w:numPr>
+        <w:spacing w:before="0" w:after="120"/>
         <w:ind w:hanging="0" w:start="0"/>
         <w:rPr/>
       </w:pPr>
@@ -3340,6 +3308,11 @@
     <w:p>
       <w:pPr>
         <w:pStyle w:val="Heading3"/>
+        <w:numPr>
+          <w:ilvl w:val="2"/>
+          <w:numId w:val="1"/>
+        </w:numPr>
+        <w:spacing w:before="0" w:after="120"/>
         <w:ind w:hanging="0" w:start="0"/>
         <w:rPr/>
       </w:pPr>
@@ -3493,6 +3466,11 @@
     <w:p>
       <w:pPr>
         <w:pStyle w:val="Heading3"/>
+        <w:numPr>
+          <w:ilvl w:val="2"/>
+          <w:numId w:val="1"/>
+        </w:numPr>
+        <w:spacing w:before="0" w:after="120"/>
         <w:ind w:hanging="0" w:start="0"/>
         <w:rPr/>
       </w:pPr>
@@ -3516,12 +3494,7 @@
         </w:rPr>
       </w:pPr>
       <w:r>
-        <w:rPr>
-          <w:b/>
-          <w:bCs/>
-          <w:sz w:val="52"/>
-          <w:szCs w:val="52"/>
-        </w:rPr>
+        <w:rPr/>
         <w:drawing>
           <wp:inline distT="0" distB="0" distL="0" distR="0">
             <wp:extent cx="6120130" cy="2635250"/>
@@ -3575,12 +3548,7 @@
         </w:rPr>
       </w:pPr>
       <w:r>
-        <w:rPr>
-          <w:b/>
-          <w:bCs/>
-          <w:sz w:val="52"/>
-          <w:szCs w:val="52"/>
-        </w:rPr>
+        <w:rPr/>
         <w:drawing>
           <wp:inline distT="0" distB="0" distL="0" distR="0">
             <wp:extent cx="6120130" cy="2503170"/>
@@ -3797,6 +3765,11 @@
     <w:p>
       <w:pPr>
         <w:pStyle w:val="Heading2"/>
+        <w:numPr>
+          <w:ilvl w:val="1"/>
+          <w:numId w:val="1"/>
+        </w:numPr>
+        <w:spacing w:before="0" w:after="120"/>
         <w:ind w:hanging="0" w:start="0"/>
         <w:rPr/>
       </w:pPr>
@@ -3810,6 +3783,10 @@
     <w:p>
       <w:pPr>
         <w:pStyle w:val="Heading3"/>
+        <w:numPr>
+          <w:ilvl w:val="2"/>
+          <w:numId w:val="1"/>
+        </w:numPr>
         <w:ind w:hanging="0" w:start="0"/>
         <w:rPr/>
       </w:pPr>
@@ -3942,6 +3919,11 @@
     <w:p>
       <w:pPr>
         <w:pStyle w:val="Heading3"/>
+        <w:numPr>
+          <w:ilvl w:val="2"/>
+          <w:numId w:val="1"/>
+        </w:numPr>
+        <w:spacing w:before="0" w:after="120"/>
         <w:ind w:hanging="0" w:start="0"/>
         <w:rPr/>
       </w:pPr>
@@ -4216,6 +4198,11 @@
     <w:p>
       <w:pPr>
         <w:pStyle w:val="Heading3"/>
+        <w:numPr>
+          <w:ilvl w:val="2"/>
+          <w:numId w:val="1"/>
+        </w:numPr>
+        <w:spacing w:before="0" w:after="120"/>
         <w:ind w:hanging="0" w:start="0"/>
         <w:rPr/>
       </w:pPr>
@@ -4504,6 +4491,7 @@
           <w:ilvl w:val="0"/>
           <w:numId w:val="2"/>
         </w:numPr>
+        <w:spacing w:before="0" w:after="120"/>
         <w:ind w:hanging="0" w:start="0"/>
         <w:jc w:val="start"/>
         <w:rPr>
@@ -4819,11 +4807,12 @@
       </w:r>
     </w:p>
     <w:sectPr>
-      <w:headerReference w:type="default" r:id="rId34"/>
-      <w:headerReference w:type="first" r:id="rId35"/>
-      <w:footerReference w:type="even" r:id="rId36"/>
-      <w:footerReference w:type="default" r:id="rId37"/>
-      <w:footerReference w:type="first" r:id="rId38"/>
+      <w:headerReference w:type="even" r:id="rId34"/>
+      <w:headerReference w:type="default" r:id="rId35"/>
+      <w:headerReference w:type="first" r:id="rId36"/>
+      <w:footerReference w:type="even" r:id="rId37"/>
+      <w:footerReference w:type="default" r:id="rId38"/>
+      <w:footerReference w:type="first" r:id="rId39"/>
       <w:type w:val="nextPage"/>
       <w:pgSz w:w="11906" w:h="16838"/>
       <w:pgMar w:left="1134" w:right="1134" w:gutter="0" w:header="1134" w:top="1693" w:footer="1134" w:bottom="1693"/>
@@ -4930,8 +4919,22 @@
     </w:pPr>
     <w:r>
       <w:rPr/>
+    </w:r>
+  </w:p>
+</w:hdr>
+</file>
+
+<file path=word/header2.xml><?xml version="1.0" encoding="utf-8"?>
+<w:hdr xmlns:o="urn:schemas-microsoft-com:office:office" xmlns:r="http://schemas.openxmlformats.org/officeDocument/2006/relationships" xmlns:v="urn:schemas-microsoft-com:vml" xmlns:w="http://schemas.openxmlformats.org/wordprocessingml/2006/main" xmlns:w10="urn:schemas-microsoft-com:office:word" xmlns:wp="http://schemas.openxmlformats.org/drawingml/2006/wordprocessingDrawing" xmlns:pic="http://schemas.openxmlformats.org/drawingml/2006/picture" xmlns:wps="http://schemas.microsoft.com/office/word/2010/wordprocessingShape" xmlns:wpg="http://schemas.microsoft.com/office/word/2010/wordprocessingGroup" xmlns:mc="http://schemas.openxmlformats.org/markup-compatibility/2006" xmlns:wp14="http://schemas.microsoft.com/office/word/2010/wordprocessingDrawing" xmlns:w14="http://schemas.microsoft.com/office/word/2010/wordml" xmlns:w15="http://schemas.microsoft.com/office/word/2012/wordml" mc:Ignorable="w14 wp14 w15">
+  <w:p>
+    <w:pPr>
+      <w:pStyle w:val="Header"/>
+      <w:rPr/>
+    </w:pPr>
+    <w:r>
+      <w:rPr/>
       <w:drawing>
-        <wp:anchor distT="0" distB="0" distL="0" distR="0" simplePos="0" relativeHeight="28" behindDoc="0" locked="0" layoutInCell="0" allowOverlap="1">
+        <wp:anchor distT="0" distB="0" distL="0" distR="0" simplePos="0" relativeHeight="37" behindDoc="1" locked="0" layoutInCell="0" allowOverlap="1">
           <wp:simplePos x="0" y="0"/>
           <wp:positionH relativeFrom="column">
             <wp:posOffset>-720090</wp:posOffset>
@@ -4981,7 +4984,7 @@
 </w:hdr>
 </file>
 
-<file path=word/header2.xml><?xml version="1.0" encoding="utf-8"?>
+<file path=word/header3.xml><?xml version="1.0" encoding="utf-8"?>
 <w:hdr xmlns:o="urn:schemas-microsoft-com:office:office" xmlns:r="http://schemas.openxmlformats.org/officeDocument/2006/relationships" xmlns:v="urn:schemas-microsoft-com:vml" xmlns:w="http://schemas.openxmlformats.org/wordprocessingml/2006/main" xmlns:w10="urn:schemas-microsoft-com:office:word" xmlns:wp="http://schemas.openxmlformats.org/drawingml/2006/wordprocessingDrawing" xmlns:pic="http://schemas.openxmlformats.org/drawingml/2006/picture" xmlns:wps="http://schemas.microsoft.com/office/word/2010/wordprocessingShape" xmlns:wpg="http://schemas.microsoft.com/office/word/2010/wordprocessingGroup" xmlns:mc="http://schemas.openxmlformats.org/markup-compatibility/2006" xmlns:wp14="http://schemas.microsoft.com/office/word/2010/wordprocessingDrawing" xmlns:w14="http://schemas.microsoft.com/office/word/2010/wordml" xmlns:w15="http://schemas.microsoft.com/office/word/2012/wordml" mc:Ignorable="w14 wp14 w15">
   <w:p>
     <w:pPr>
@@ -5010,11 +5013,11 @@
         </w:tabs>
         <w:ind w:start="0" w:hanging="0"/>
       </w:pPr>
+      <w:rPr/>
     </w:lvl>
     <w:lvl w:ilvl="1">
       <w:start w:val="1"/>
       <w:numFmt w:val="none"/>
-      <w:pStyle w:val="Heading2"/>
       <w:suff w:val="nothing"/>
       <w:lvlText w:val=""/>
       <w:lvlJc w:val="start"/>
@@ -5024,11 +5027,11 @@
         </w:tabs>
         <w:ind w:start="0" w:hanging="0"/>
       </w:pPr>
+      <w:rPr/>
     </w:lvl>
     <w:lvl w:ilvl="2">
       <w:start w:val="1"/>
       <w:numFmt w:val="none"/>
-      <w:pStyle w:val="Heading3"/>
       <w:suff w:val="nothing"/>
       <w:lvlText w:val=""/>
       <w:lvlJc w:val="start"/>
@@ -5038,11 +5041,11 @@
         </w:tabs>
         <w:ind w:start="0" w:hanging="0"/>
       </w:pPr>
+      <w:rPr/>
     </w:lvl>
     <w:lvl w:ilvl="3">
       <w:start w:val="1"/>
       <w:numFmt w:val="none"/>
-      <w:pStyle w:val="Heading4"/>
       <w:suff w:val="nothing"/>
       <w:lvlText w:val=""/>
       <w:lvlJc w:val="start"/>
@@ -5052,6 +5055,7 @@
         </w:tabs>
         <w:ind w:start="0" w:hanging="0"/>
       </w:pPr>
+      <w:rPr/>
     </w:lvl>
     <w:lvl w:ilvl="4">
       <w:start w:val="1"/>
@@ -5065,6 +5069,7 @@
         </w:tabs>
         <w:ind w:start="0" w:hanging="0"/>
       </w:pPr>
+      <w:rPr/>
     </w:lvl>
     <w:lvl w:ilvl="5">
       <w:start w:val="1"/>
@@ -5078,6 +5083,7 @@
         </w:tabs>
         <w:ind w:start="0" w:hanging="0"/>
       </w:pPr>
+      <w:rPr/>
     </w:lvl>
     <w:lvl w:ilvl="6">
       <w:start w:val="1"/>
@@ -5091,6 +5097,7 @@
         </w:tabs>
         <w:ind w:start="0" w:hanging="0"/>
       </w:pPr>
+      <w:rPr/>
     </w:lvl>
     <w:lvl w:ilvl="7">
       <w:start w:val="1"/>
@@ -5104,6 +5111,7 @@
         </w:tabs>
         <w:ind w:start="0" w:hanging="0"/>
       </w:pPr>
+      <w:rPr/>
     </w:lvl>
     <w:lvl w:ilvl="8">
       <w:start w:val="1"/>
@@ -5117,6 +5125,7 @@
         </w:tabs>
         <w:ind w:start="0" w:hanging="0"/>
       </w:pPr>
+      <w:rPr/>
     </w:lvl>
   </w:abstractNum>
   <w:abstractNum w:abstractNumId="2">
@@ -5364,6 +5373,125 @@
         <w:ind w:start="6381" w:hanging="283"/>
       </w:pPr>
       <w:rPr/>
+    </w:lvl>
+  </w:abstractNum>
+  <w:abstractNum w:abstractNumId="4">
+    <w:lvl w:ilvl="0">
+      <w:start w:val="1"/>
+      <w:numFmt w:val="none"/>
+      <w:suff w:val="nothing"/>
+      <w:lvlText w:val=""/>
+      <w:lvlJc w:val="start"/>
+      <w:pPr>
+        <w:tabs>
+          <w:tab w:val="num" w:pos="0"/>
+        </w:tabs>
+        <w:ind w:start="0" w:hanging="0"/>
+      </w:pPr>
+    </w:lvl>
+    <w:lvl w:ilvl="1">
+      <w:start w:val="1"/>
+      <w:numFmt w:val="none"/>
+      <w:suff w:val="nothing"/>
+      <w:lvlText w:val=""/>
+      <w:lvlJc w:val="start"/>
+      <w:pPr>
+        <w:tabs>
+          <w:tab w:val="num" w:pos="0"/>
+        </w:tabs>
+        <w:ind w:start="0" w:hanging="0"/>
+      </w:pPr>
+    </w:lvl>
+    <w:lvl w:ilvl="2">
+      <w:start w:val="1"/>
+      <w:numFmt w:val="none"/>
+      <w:suff w:val="nothing"/>
+      <w:lvlText w:val=""/>
+      <w:lvlJc w:val="start"/>
+      <w:pPr>
+        <w:tabs>
+          <w:tab w:val="num" w:pos="0"/>
+        </w:tabs>
+        <w:ind w:start="0" w:hanging="0"/>
+      </w:pPr>
+    </w:lvl>
+    <w:lvl w:ilvl="3">
+      <w:start w:val="1"/>
+      <w:numFmt w:val="none"/>
+      <w:suff w:val="nothing"/>
+      <w:lvlText w:val=""/>
+      <w:lvlJc w:val="start"/>
+      <w:pPr>
+        <w:tabs>
+          <w:tab w:val="num" w:pos="0"/>
+        </w:tabs>
+        <w:ind w:start="0" w:hanging="0"/>
+      </w:pPr>
+    </w:lvl>
+    <w:lvl w:ilvl="4">
+      <w:start w:val="1"/>
+      <w:numFmt w:val="none"/>
+      <w:suff w:val="nothing"/>
+      <w:lvlText w:val=""/>
+      <w:lvlJc w:val="start"/>
+      <w:pPr>
+        <w:tabs>
+          <w:tab w:val="num" w:pos="0"/>
+        </w:tabs>
+        <w:ind w:start="0" w:hanging="0"/>
+      </w:pPr>
+    </w:lvl>
+    <w:lvl w:ilvl="5">
+      <w:start w:val="1"/>
+      <w:numFmt w:val="none"/>
+      <w:suff w:val="nothing"/>
+      <w:lvlText w:val=""/>
+      <w:lvlJc w:val="start"/>
+      <w:pPr>
+        <w:tabs>
+          <w:tab w:val="num" w:pos="0"/>
+        </w:tabs>
+        <w:ind w:start="0" w:hanging="0"/>
+      </w:pPr>
+    </w:lvl>
+    <w:lvl w:ilvl="6">
+      <w:start w:val="1"/>
+      <w:numFmt w:val="none"/>
+      <w:suff w:val="nothing"/>
+      <w:lvlText w:val=""/>
+      <w:lvlJc w:val="start"/>
+      <w:pPr>
+        <w:tabs>
+          <w:tab w:val="num" w:pos="0"/>
+        </w:tabs>
+        <w:ind w:start="0" w:hanging="0"/>
+      </w:pPr>
+    </w:lvl>
+    <w:lvl w:ilvl="7">
+      <w:start w:val="1"/>
+      <w:numFmt w:val="none"/>
+      <w:suff w:val="nothing"/>
+      <w:lvlText w:val=""/>
+      <w:lvlJc w:val="start"/>
+      <w:pPr>
+        <w:tabs>
+          <w:tab w:val="num" w:pos="0"/>
+        </w:tabs>
+        <w:ind w:start="0" w:hanging="0"/>
+      </w:pPr>
+    </w:lvl>
+    <w:lvl w:ilvl="8">
+      <w:start w:val="1"/>
+      <w:numFmt w:val="none"/>
+      <w:suff w:val="nothing"/>
+      <w:lvlText w:val=""/>
+      <w:lvlJc w:val="start"/>
+      <w:pPr>
+        <w:tabs>
+          <w:tab w:val="num" w:pos="0"/>
+        </w:tabs>
+        <w:ind w:start="0" w:hanging="0"/>
+      </w:pPr>
     </w:lvl>
   </w:abstractNum>
   <w:num w:numId="1">
@@ -5374,6 +5502,9 @@
   </w:num>
   <w:num w:numId="3">
     <w:abstractNumId w:val="3"/>
+  </w:num>
+  <w:num w:numId="4">
+    <w:abstractNumId w:val="4"/>
   </w:num>
 </w:numbering>
 </file>
@@ -5417,7 +5548,7 @@
   </w:style>
   <w:style w:type="paragraph" w:styleId="Heading1">
     <w:name w:val="heading 1"/>
-    <w:basedOn w:val="Ttulo"/>
+    <w:basedOn w:val="Ttulouser"/>
     <w:next w:val="BodyText"/>
     <w:qFormat/>
     <w:pPr>
@@ -5437,7 +5568,7 @@
   </w:style>
   <w:style w:type="paragraph" w:styleId="Heading2">
     <w:name w:val="heading 2"/>
-    <w:basedOn w:val="Ttulo"/>
+    <w:basedOn w:val="Ttulouser"/>
     <w:next w:val="BodyText"/>
     <w:qFormat/>
     <w:pPr>
@@ -5457,7 +5588,7 @@
   </w:style>
   <w:style w:type="paragraph" w:styleId="Heading3">
     <w:name w:val="heading 3"/>
-    <w:basedOn w:val="Ttulo"/>
+    <w:basedOn w:val="Ttulouser"/>
     <w:next w:val="BodyText"/>
     <w:qFormat/>
     <w:pPr>
@@ -5477,7 +5608,7 @@
   </w:style>
   <w:style w:type="paragraph" w:styleId="Heading4">
     <w:name w:val="heading 4"/>
-    <w:basedOn w:val="Ttulo"/>
+    <w:basedOn w:val="Ttulouser"/>
     <w:next w:val="BodyText"/>
     <w:qFormat/>
     <w:pPr>
@@ -5504,8 +5635,8 @@
       <w:u w:val="single"/>
     </w:rPr>
   </w:style>
-  <w:style w:type="character" w:styleId="Smbolosdenumeracin">
-    <w:name w:val="Símbolos de numeración"/>
+  <w:style w:type="character" w:styleId="Smbolosdenumeracinuser">
+    <w:name w:val="Símbolos de numeración (user)"/>
     <w:qFormat/>
     <w:rPr/>
   </w:style>
@@ -5524,8 +5655,8 @@
       <w:iCs/>
     </w:rPr>
   </w:style>
-  <w:style w:type="character" w:styleId="Enlacedelndice">
-    <w:name w:val="Enlace del índice"/>
+  <w:style w:type="character" w:styleId="Enlacedelndiceuser">
+    <w:name w:val="Enlace del índice (user)"/>
     <w:qFormat/>
     <w:rPr/>
   </w:style>
@@ -5537,7 +5668,6 @@
     <w:pPr>
       <w:keepNext w:val="true"/>
       <w:spacing w:before="240" w:after="120"/>
-      <w:jc w:val="start"/>
     </w:pPr>
     <w:rPr>
       <w:rFonts w:ascii="Liberation Sans" w:hAnsi="Liberation Sans" w:eastAsia="Microsoft YaHei" w:cs="Arial"/>
@@ -5597,6 +5727,7 @@
     <w:pPr>
       <w:keepNext w:val="true"/>
       <w:spacing w:before="240" w:after="120"/>
+      <w:jc w:val="start"/>
     </w:pPr>
     <w:rPr>
       <w:rFonts w:ascii="Liberation Sans" w:hAnsi="Liberation Sans" w:eastAsia="Microsoft YaHei" w:cs="Arial"/>
@@ -5615,8 +5746,8 @@
       <w:rFonts w:cs="Arial"/>
     </w:rPr>
   </w:style>
-  <w:style w:type="paragraph" w:styleId="Cabeceraypie">
-    <w:name w:val="Cabecera y pie"/>
+  <w:style w:type="paragraph" w:styleId="Cabeceraypieuser">
+    <w:name w:val="Cabecera y pie (user)"/>
     <w:basedOn w:val="Normal"/>
     <w:qFormat/>
     <w:pPr>
@@ -5629,8 +5760,8 @@
     </w:pPr>
     <w:rPr/>
   </w:style>
-  <w:style w:type="paragraph" w:styleId="Cabeceraypieuser">
-    <w:name w:val="Cabecera y pie (user)"/>
+  <w:style w:type="paragraph" w:styleId="Cabeceraypie">
+    <w:name w:val="Cabecera y pie"/>
     <w:basedOn w:val="Normal"/>
     <w:qFormat/>
     <w:pPr/>
@@ -5638,7 +5769,7 @@
   </w:style>
   <w:style w:type="paragraph" w:styleId="Footer">
     <w:name w:val="footer"/>
-    <w:basedOn w:val="Cabeceraypie"/>
+    <w:basedOn w:val="Cabeceraypieuser"/>
     <w:pPr>
       <w:suppressLineNumbers/>
     </w:pPr>
@@ -5646,7 +5777,7 @@
   </w:style>
   <w:style w:type="paragraph" w:styleId="IndexHeading">
     <w:name w:val="index heading"/>
-    <w:basedOn w:val="Ttulo"/>
+    <w:basedOn w:val="Ttulouser"/>
     <w:pPr>
       <w:suppressLineNumbers/>
       <w:ind w:hanging="0" w:start="0"/>
@@ -5658,8 +5789,8 @@
       <w:szCs w:val="32"/>
     </w:rPr>
   </w:style>
-  <w:style w:type="paragraph" w:styleId="Ttulodelndicedeusuario">
-    <w:name w:val="Título del índice de usuario"/>
+  <w:style w:type="paragraph" w:styleId="Ttulodelndicedeusuariouser">
+    <w:name w:val="Título del índice de usuario (user)"/>
     <w:basedOn w:val="IndexHeading"/>
     <w:qFormat/>
     <w:pPr>
@@ -5672,6 +5803,32 @@
       <w:sz w:val="32"/>
       <w:szCs w:val="32"/>
     </w:rPr>
+  </w:style>
+  <w:style w:type="paragraph" w:styleId="ndicedeusuario1user">
+    <w:name w:val="Índice de usuario 1 (user)"/>
+    <w:basedOn w:val="ndiceuser"/>
+    <w:qFormat/>
+    <w:pPr>
+      <w:tabs>
+        <w:tab w:val="clear" w:pos="709"/>
+        <w:tab w:val="right" w:pos="9638" w:leader="dot"/>
+      </w:tabs>
+      <w:ind w:hanging="0" w:start="0"/>
+    </w:pPr>
+    <w:rPr/>
+  </w:style>
+  <w:style w:type="paragraph" w:styleId="ndicedeusuario2user">
+    <w:name w:val="Índice de usuario 2 (user)"/>
+    <w:basedOn w:val="ndiceuser"/>
+    <w:qFormat/>
+    <w:pPr>
+      <w:tabs>
+        <w:tab w:val="clear" w:pos="709"/>
+        <w:tab w:val="right" w:pos="9355" w:leader="dot"/>
+      </w:tabs>
+      <w:ind w:hanging="0" w:start="283"/>
+    </w:pPr>
+    <w:rPr/>
   </w:style>
   <w:style w:type="paragraph" w:styleId="ndicedeusuario1">
     <w:name w:val="Índice de usuario 1"/>
@@ -5699,34 +5856,8 @@
     </w:pPr>
     <w:rPr/>
   </w:style>
-  <w:style w:type="paragraph" w:styleId="ndicedeusuario1user">
-    <w:name w:val="Índice de usuario 1 (user)"/>
-    <w:basedOn w:val="ndiceuser"/>
-    <w:qFormat/>
-    <w:pPr>
-      <w:tabs>
-        <w:tab w:val="clear" w:pos="709"/>
-        <w:tab w:val="right" w:pos="9638" w:leader="dot"/>
-      </w:tabs>
-      <w:ind w:hanging="0" w:start="0"/>
-    </w:pPr>
-    <w:rPr/>
-  </w:style>
-  <w:style w:type="paragraph" w:styleId="ndicedeusuario2user">
-    <w:name w:val="Índice de usuario 2 (user)"/>
-    <w:basedOn w:val="ndiceuser"/>
-    <w:qFormat/>
-    <w:pPr>
-      <w:tabs>
-        <w:tab w:val="clear" w:pos="709"/>
-        <w:tab w:val="right" w:pos="9355" w:leader="dot"/>
-      </w:tabs>
-      <w:ind w:hanging="0" w:start="283"/>
-    </w:pPr>
-    <w:rPr/>
-  </w:style>
-  <w:style w:type="paragraph" w:styleId="Contenidodelatablauser">
-    <w:name w:val="Contenido de la tabla (user)"/>
+  <w:style w:type="paragraph" w:styleId="Contenidodelatabla">
+    <w:name w:val="Contenido de la tabla"/>
     <w:basedOn w:val="Normal"/>
     <w:qFormat/>
     <w:pPr>
@@ -5735,8 +5866,8 @@
     </w:pPr>
     <w:rPr/>
   </w:style>
-  <w:style w:type="paragraph" w:styleId="Ttulodelndicedeusuariouser">
-    <w:name w:val="Título del índice de usuario (user)"/>
+  <w:style w:type="paragraph" w:styleId="Ttulodelndicedeusuario">
+    <w:name w:val="Título del índice de usuario"/>
     <w:basedOn w:val="IndexHeading"/>
     <w:qFormat/>
     <w:pPr>
@@ -5748,6 +5879,32 @@
       <w:bCs/>
       <w:sz w:val="32"/>
       <w:szCs w:val="32"/>
+    </w:rPr>
+  </w:style>
+  <w:style w:type="paragraph" w:styleId="ndicedeusuario3">
+    <w:name w:val="Índice de usuario 3"/>
+    <w:basedOn w:val="ndice"/>
+    <w:qFormat/>
+    <w:pPr>
+      <w:tabs>
+        <w:tab w:val="clear" w:pos="709"/>
+        <w:tab w:val="right" w:pos="9071" w:leader="dot"/>
+      </w:tabs>
+      <w:ind w:hanging="0" w:start="567"/>
+    </w:pPr>
+    <w:rPr/>
+  </w:style>
+  <w:style w:type="paragraph" w:styleId="Ttulodelatabla">
+    <w:name w:val="Título de la tabla"/>
+    <w:basedOn w:val="Contenidodelatabla"/>
+    <w:qFormat/>
+    <w:pPr>
+      <w:suppressLineNumbers/>
+      <w:jc w:val="center"/>
+    </w:pPr>
+    <w:rPr>
+      <w:b/>
+      <w:bCs/>
     </w:rPr>
   </w:style>
   <w:style w:type="paragraph" w:styleId="ndicedeusuario3user">
@@ -5763,35 +5920,9 @@
     </w:pPr>
     <w:rPr/>
   </w:style>
-  <w:style w:type="paragraph" w:styleId="Ttulodelatablauser">
-    <w:name w:val="Título de la tabla (user)"/>
-    <w:basedOn w:val="Contenidodelatablauser"/>
-    <w:qFormat/>
-    <w:pPr>
-      <w:suppressLineNumbers/>
-      <w:jc w:val="center"/>
-    </w:pPr>
-    <w:rPr>
-      <w:b/>
-      <w:bCs/>
-    </w:rPr>
-  </w:style>
-  <w:style w:type="paragraph" w:styleId="ndicedeusuario3">
-    <w:name w:val="Índice de usuario 3"/>
-    <w:basedOn w:val="ndice"/>
-    <w:qFormat/>
-    <w:pPr>
-      <w:tabs>
-        <w:tab w:val="clear" w:pos="709"/>
-        <w:tab w:val="right" w:pos="9071" w:leader="dot"/>
-      </w:tabs>
-      <w:ind w:hanging="0" w:start="567"/>
-    </w:pPr>
-    <w:rPr/>
-  </w:style>
   <w:style w:type="paragraph" w:styleId="Header">
     <w:name w:val="header"/>
-    <w:basedOn w:val="Cabeceraypie"/>
+    <w:basedOn w:val="Cabeceraypieuser"/>
     <w:pPr>
       <w:suppressLineNumbers/>
     </w:pPr>
@@ -5814,7 +5945,7 @@
   </w:style>
   <w:style w:type="paragraph" w:styleId="TOC1">
     <w:name w:val="toc 1"/>
-    <w:basedOn w:val="ndice"/>
+    <w:basedOn w:val="ndiceuser"/>
     <w:pPr>
       <w:tabs>
         <w:tab w:val="clear" w:pos="709"/>
@@ -5826,7 +5957,7 @@
   </w:style>
   <w:style w:type="paragraph" w:styleId="TOC2">
     <w:name w:val="toc 2"/>
-    <w:basedOn w:val="ndice"/>
+    <w:basedOn w:val="ndiceuser"/>
     <w:pPr>
       <w:tabs>
         <w:tab w:val="clear" w:pos="709"/>
@@ -5838,7 +5969,7 @@
   </w:style>
   <w:style w:type="paragraph" w:styleId="TOC3">
     <w:name w:val="toc 3"/>
-    <w:basedOn w:val="ndice"/>
+    <w:basedOn w:val="ndiceuser"/>
     <w:pPr>
       <w:tabs>
         <w:tab w:val="clear" w:pos="709"/>

</xml_diff>